<commit_message>
fix(deploy): bind host to 0.0.0.0 and support HEAD requests for Render health checks
</commit_message>
<xml_diff>
--- a/docs/SIH26153_Project_Documentation.docx
+++ b/docs/SIH26153_Project_Documentation.docx
@@ -202,13 +202,7 @@
         <w:spacing w:after="100"/>
       </w:pPr>
       <w:r>
-        <w:t>Solution</w:t>
-      </w:r>
-      <w:r>
-        <w:t xml:space="preserve"> proposes an AI-based network attack forecasting platform</w:t>
-      </w:r>
-      <w:r>
-        <w:t xml:space="preserve"> </w:t>
+        <w:t xml:space="preserve">Solution proposes an AI-based network attack forecasting platform </w:t>
       </w:r>
       <w:r>
         <w:rPr>
@@ -369,6 +363,10 @@
     <w:p>
       <w:pPr>
         <w:pStyle w:val="ListNumber"/>
+        <w:numPr>
+          <w:ilvl w:val="0"/>
+          <w:numId w:val="10"/>
+        </w:numPr>
         <w:spacing w:after="40"/>
       </w:pPr>
       <w:r>
@@ -378,6 +376,10 @@
     <w:p>
       <w:pPr>
         <w:pStyle w:val="ListNumber"/>
+        <w:numPr>
+          <w:ilvl w:val="0"/>
+          <w:numId w:val="10"/>
+        </w:numPr>
         <w:spacing w:after="40"/>
       </w:pPr>
       <w:r>
@@ -387,6 +389,10 @@
     <w:p>
       <w:pPr>
         <w:pStyle w:val="ListNumber"/>
+        <w:numPr>
+          <w:ilvl w:val="0"/>
+          <w:numId w:val="10"/>
+        </w:numPr>
         <w:spacing w:after="40"/>
       </w:pPr>
       <w:r>
@@ -396,7 +402,12 @@
     <w:p>
       <w:pPr>
         <w:pStyle w:val="ListNumber"/>
+        <w:numPr>
+          <w:ilvl w:val="0"/>
+          <w:numId w:val="10"/>
+        </w:numPr>
         <w:spacing w:after="40"/>
+        <w:jc w:val="both"/>
       </w:pPr>
       <w:r>
         <w:t>Develop a baseline intrusion/infiltration prediction model using logistic regression.</w:t>
@@ -405,6 +416,10 @@
     <w:p>
       <w:pPr>
         <w:pStyle w:val="ListNumber"/>
+        <w:numPr>
+          <w:ilvl w:val="0"/>
+          <w:numId w:val="10"/>
+        </w:numPr>
         <w:spacing w:after="40"/>
       </w:pPr>
       <w:r>
@@ -414,6 +429,10 @@
     <w:p>
       <w:pPr>
         <w:pStyle w:val="ListNumber"/>
+        <w:numPr>
+          <w:ilvl w:val="0"/>
+          <w:numId w:val="10"/>
+        </w:numPr>
         <w:spacing w:after="40"/>
       </w:pPr>
       <w:r>
@@ -423,6 +442,10 @@
     <w:p>
       <w:pPr>
         <w:pStyle w:val="ListNumber"/>
+        <w:numPr>
+          <w:ilvl w:val="0"/>
+          <w:numId w:val="10"/>
+        </w:numPr>
         <w:spacing w:after="40"/>
       </w:pPr>
       <w:r>
@@ -432,6 +455,10 @@
     <w:p>
       <w:pPr>
         <w:pStyle w:val="ListNumber"/>
+        <w:numPr>
+          <w:ilvl w:val="0"/>
+          <w:numId w:val="10"/>
+        </w:numPr>
         <w:spacing w:after="40"/>
       </w:pPr>
       <w:r>
@@ -441,6 +468,10 @@
     <w:p>
       <w:pPr>
         <w:pStyle w:val="ListNumber"/>
+        <w:numPr>
+          <w:ilvl w:val="0"/>
+          <w:numId w:val="10"/>
+        </w:numPr>
         <w:spacing w:after="40"/>
       </w:pPr>
       <w:r>
@@ -450,6 +481,10 @@
     <w:p>
       <w:pPr>
         <w:pStyle w:val="ListNumber"/>
+        <w:numPr>
+          <w:ilvl w:val="0"/>
+          <w:numId w:val="10"/>
+        </w:numPr>
         <w:spacing w:after="40"/>
       </w:pPr>
       <w:r>
@@ -459,6 +494,10 @@
     <w:p>
       <w:pPr>
         <w:pStyle w:val="ListNumber"/>
+        <w:numPr>
+          <w:ilvl w:val="0"/>
+          <w:numId w:val="10"/>
+        </w:numPr>
         <w:spacing w:after="40"/>
       </w:pPr>
       <w:r>
@@ -468,6 +507,10 @@
     <w:p>
       <w:pPr>
         <w:pStyle w:val="ListNumber"/>
+        <w:numPr>
+          <w:ilvl w:val="0"/>
+          <w:numId w:val="10"/>
+        </w:numPr>
         <w:spacing w:after="40"/>
       </w:pPr>
       <w:r>
@@ -480,14 +523,6 @@
       </w:pPr>
       <w:r>
         <w:t>4. Scope of the Proposed Solution</w:t>
-      </w:r>
-    </w:p>
-    <w:p>
-      <w:pPr>
-        <w:pStyle w:val="Heading2"/>
-      </w:pPr>
-      <w:r>
-        <w:t>4.1 In Scope</w:t>
       </w:r>
     </w:p>
     <w:p>
@@ -595,103 +630,15 @@
         <w:spacing w:after="40"/>
       </w:pPr>
       <w:r>
+        <w:t>Evaluation against a logistic-regression baseline.</w:t>
+      </w:r>
+    </w:p>
+    <w:p>
+      <w:pPr>
+        <w:pStyle w:val="Heading1"/>
+      </w:pPr>
+      <w:r>
         <w:lastRenderedPageBreak/>
-        <w:t>Evaluation against a logistic-regression baseline.</w:t>
-      </w:r>
-    </w:p>
-    <w:p>
-      <w:pPr>
-        <w:pStyle w:val="Heading2"/>
-      </w:pPr>
-      <w:r>
-        <w:t>4.2 Outside the Core Scope</w:t>
-      </w:r>
-    </w:p>
-    <w:p>
-      <w:pPr>
-        <w:pStyle w:val="ListBullet"/>
-        <w:spacing w:after="40"/>
-      </w:pPr>
-      <w:r>
-        <w:t>Autonomous blocking or automated offensive response.</w:t>
-      </w:r>
-    </w:p>
-    <w:p>
-      <w:pPr>
-        <w:pStyle w:val="ListBullet"/>
-        <w:spacing w:after="40"/>
-      </w:pPr>
-      <w:r>
-        <w:t>Cloud-based inference.</w:t>
-      </w:r>
-    </w:p>
-    <w:p>
-      <w:pPr>
-        <w:pStyle w:val="ListBullet"/>
-        <w:spacing w:after="40"/>
-      </w:pPr>
-      <w:r>
-        <w:t>Dependence on proprietary threat-intelligence APIs.</w:t>
-      </w:r>
-    </w:p>
-    <w:p>
-      <w:pPr>
-        <w:pStyle w:val="ListBullet"/>
-        <w:spacing w:after="40"/>
-      </w:pPr>
-      <w:r>
-        <w:t>A full enterprise SIEM replacement.</w:t>
-      </w:r>
-    </w:p>
-    <w:p>
-      <w:pPr>
-        <w:pStyle w:val="ListBullet"/>
-        <w:spacing w:after="40"/>
-      </w:pPr>
-      <w:r>
-        <w:t>Malware sandboxing.</w:t>
-      </w:r>
-    </w:p>
-    <w:p>
-      <w:pPr>
-        <w:pStyle w:val="ListBullet"/>
-        <w:spacing w:after="40"/>
-      </w:pPr>
-      <w:r>
-        <w:t>Endpoint detection and response.</w:t>
-      </w:r>
-    </w:p>
-    <w:p>
-      <w:pPr>
-        <w:pStyle w:val="ListBullet"/>
-        <w:spacing w:after="40"/>
-      </w:pPr>
-      <w:r>
-        <w:t>A requirement to calculate an attack probability for every individual node.</w:t>
-      </w:r>
-    </w:p>
-    <w:p>
-      <w:pPr>
-        <w:pStyle w:val="ListBullet"/>
-        <w:spacing w:after="40"/>
-      </w:pPr>
-      <w:r>
-        <w:t>Large language model-based reasoning as a core component.</w:t>
-      </w:r>
-    </w:p>
-    <w:p>
-      <w:pPr>
-        <w:spacing w:after="100"/>
-      </w:pPr>
-      <w:r>
-        <w:t>These capabilities may be considered future extensions, but they are not required for the core SIH26153 solution.</w:t>
-      </w:r>
-    </w:p>
-    <w:p>
-      <w:pPr>
-        <w:pStyle w:val="Heading1"/>
-      </w:pPr>
-      <w:r>
         <w:t>5. Conceptual Foundation</w:t>
       </w:r>
     </w:p>
@@ -750,7 +697,19 @@
               <w:rPr>
                 <w:b/>
               </w:rPr>
-              <w:t>Proposed SIH26153 Approach</w:t>
+              <w:t>Proposed</w:t>
+            </w:r>
+            <w:r>
+              <w:rPr>
+                <w:b/>
+              </w:rPr>
+              <w:t xml:space="preserve"> </w:t>
+            </w:r>
+            <w:r>
+              <w:rPr>
+                <w:b/>
+              </w:rPr>
+              <w:t>Approach</w:t>
             </w:r>
           </w:p>
         </w:tc>
@@ -899,8 +858,13 @@
             <w:tcW w:w="3312" w:type="dxa"/>
           </w:tcPr>
           <w:p>
-            <w:r>
-              <w:t>Usually absent</w:t>
+            <w:proofErr w:type="gramStart"/>
+            <w:r>
+              <w:t>Usually</w:t>
+            </w:r>
+            <w:proofErr w:type="gramEnd"/>
+            <w:r>
+              <w:t xml:space="preserve"> absent</w:t>
             </w:r>
           </w:p>
         </w:tc>
@@ -993,7 +957,15 @@
         <w:spacing w:after="100"/>
       </w:pPr>
       <w:r>
-        <w:t>A network state S_t represents the observable condition of the network during a defined time window. It can contain aggregate traffic statistics, host activity, protocol and port activity, TCP behavior, timing information, packet characteristics, and relationships between communicating hosts.</w:t>
+        <w:t xml:space="preserve">A network state </w:t>
+      </w:r>
+      <w:proofErr w:type="spellStart"/>
+      <w:r>
+        <w:t>S_t</w:t>
+      </w:r>
+      <w:proofErr w:type="spellEnd"/>
+      <w:r>
+        <w:t xml:space="preserve"> represents the observable condition of the network during a defined time window. It can contain aggregate traffic statistics, host activity, protocol and port activity, TCP behavior, timing information, packet characteristics, and relationships between communicating hosts.</w:t>
       </w:r>
     </w:p>
     <w:p>
@@ -1001,7 +973,47 @@
         <w:spacing w:after="100"/>
       </w:pPr>
       <w:r>
-        <w:t>A structured representation can be written conceptually as S_t = [f1, f2, ..., fn]. An alternative representation is a communication graph G_t = (V_t, E_t), where nodes represent hosts and edges represent communication flows with traffic attributes.</w:t>
+        <w:t xml:space="preserve">A structured representation can be written conceptually as </w:t>
+      </w:r>
+      <w:proofErr w:type="spellStart"/>
+      <w:r>
+        <w:t>S_t</w:t>
+      </w:r>
+      <w:proofErr w:type="spellEnd"/>
+      <w:r>
+        <w:t xml:space="preserve"> = [f1, f2, ..., </w:t>
+      </w:r>
+      <w:proofErr w:type="spellStart"/>
+      <w:r>
+        <w:t>fn</w:t>
+      </w:r>
+      <w:proofErr w:type="spellEnd"/>
+      <w:r>
+        <w:t xml:space="preserve">]. An alternative representation is a communication graph </w:t>
+      </w:r>
+      <w:proofErr w:type="spellStart"/>
+      <w:r>
+        <w:t>G_t</w:t>
+      </w:r>
+      <w:proofErr w:type="spellEnd"/>
+      <w:r>
+        <w:t xml:space="preserve"> = (</w:t>
+      </w:r>
+      <w:proofErr w:type="spellStart"/>
+      <w:r>
+        <w:t>V_t</w:t>
+      </w:r>
+      <w:proofErr w:type="spellEnd"/>
+      <w:r>
+        <w:t xml:space="preserve">, </w:t>
+      </w:r>
+      <w:proofErr w:type="spellStart"/>
+      <w:r>
+        <w:t>E_t</w:t>
+      </w:r>
+      <w:proofErr w:type="spellEnd"/>
+      <w:r>
+        <w:t>), where nodes represent hosts and edges represent communication flows with traffic attributes.</w:t>
       </w:r>
     </w:p>
     <w:p>
@@ -1025,7 +1037,15 @@
         <w:spacing w:after="100"/>
       </w:pPr>
       <w:r>
-        <w:t>Conceptually, the model learns a transition relationship such as P(S_(t+1) | S_t). Once trained, the model can use the latest observed state to predict future states and recursively roll them forward for K steps.</w:t>
+        <w:t xml:space="preserve">Conceptually, the model learns a transition relationship such as P(S_(t+1) | </w:t>
+      </w:r>
+      <w:proofErr w:type="spellStart"/>
+      <w:r>
+        <w:t>S_t</w:t>
+      </w:r>
+      <w:proofErr w:type="spellEnd"/>
+      <w:r>
+        <w:t>). Once trained, the model can use the latest observed state to predict future states and recursively roll them forward for K steps.</w:t>
       </w:r>
     </w:p>
     <w:p>
@@ -1041,7 +1061,6 @@
         <w:pStyle w:val="Heading1"/>
       </w:pPr>
       <w:r>
-        <w:lastRenderedPageBreak/>
         <w:t>6. Input Specification</w:t>
       </w:r>
     </w:p>
@@ -1139,6 +1158,7 @@
         <w:pStyle w:val="Heading2"/>
       </w:pPr>
       <w:r>
+        <w:lastRenderedPageBreak/>
         <w:t>6.2 Packet-Level Input</w:t>
       </w:r>
     </w:p>
@@ -1309,8 +1329,13 @@
           </w:tcPr>
           <w:p>
             <w:r>
-              <w:t>Infiltration likelihood at t+1, t+2, ..., t+K</w:t>
-            </w:r>
+              <w:t xml:space="preserve">Infiltration likelihood at t+1, t+2, ..., </w:t>
+            </w:r>
+            <w:proofErr w:type="spellStart"/>
+            <w:r>
+              <w:t>t+K</w:t>
+            </w:r>
+            <w:proofErr w:type="spellEnd"/>
           </w:p>
         </w:tc>
       </w:tr>
@@ -1488,8 +1513,72 @@
         <w:pStyle w:val="Heading3"/>
       </w:pPr>
       <w:r>
+        <w:t>Step 3: Packet Parsing</w:t>
+      </w:r>
+    </w:p>
+    <w:p>
+      <w:pPr>
+        <w:spacing w:after="100"/>
+      </w:pPr>
+      <w:r>
+        <w:t>For PCAP inputs, parse packet headers and timing information using a local packet-processing library.</w:t>
+      </w:r>
+    </w:p>
+    <w:p>
+      <w:pPr>
+        <w:pStyle w:val="Heading3"/>
+      </w:pPr>
+      <w:r>
+        <w:t>Step 4: Feature Extraction</w:t>
+      </w:r>
+    </w:p>
+    <w:p>
+      <w:pPr>
+        <w:spacing w:after="100"/>
+      </w:pPr>
+      <w:r>
+        <w:t>Extract the required flow-level and packet-level features.</w:t>
+      </w:r>
+    </w:p>
+    <w:p>
+      <w:pPr>
+        <w:pStyle w:val="Heading3"/>
+      </w:pPr>
+      <w:r>
+        <w:t>Step 5: Feature Fusion</w:t>
+      </w:r>
+    </w:p>
+    <w:p>
+      <w:pPr>
+        <w:spacing w:after="100"/>
+      </w:pPr>
+      <w:r>
+        <w:t>Align packet-derived and flow-derived observations using timestamps and network identifiers.</w:t>
+      </w:r>
+    </w:p>
+    <w:p>
+      <w:pPr>
+        <w:pStyle w:val="Heading3"/>
+      </w:pPr>
+      <w:r>
+        <w:t>Step 6: Time Windowing</w:t>
+      </w:r>
+    </w:p>
+    <w:p>
+      <w:pPr>
+        <w:spacing w:after="100"/>
+      </w:pPr>
+      <w:r>
+        <w:t>Partition traffic into sequential windows. Window duration is a tunable design parameter, not a fixed SIH-mandated value.</w:t>
+      </w:r>
+    </w:p>
+    <w:p>
+      <w:pPr>
+        <w:pStyle w:val="Heading3"/>
+      </w:pPr>
+      <w:r>
         <w:lastRenderedPageBreak/>
-        <w:t>Step 3: Packet Parsing</w:t>
+        <w:t>Step 7: Network-State Construction</w:t>
       </w:r>
     </w:p>
     <w:p>
@@ -1497,7 +1586,7 @@
         <w:spacing w:after="100"/>
       </w:pPr>
       <w:r>
-        <w:t>For PCAP inputs, parse packet headers and timing information using a local packet-processing library.</w:t>
+        <w:t>Convert each time window into a structured state vector and optionally a communication graph.</w:t>
       </w:r>
     </w:p>
     <w:p>
@@ -1505,7 +1594,7 @@
         <w:pStyle w:val="Heading3"/>
       </w:pPr>
       <w:r>
-        <w:t>Step 4: Feature Extraction</w:t>
+        <w:t>Step 8: Preprocessing</w:t>
       </w:r>
     </w:p>
     <w:p>
@@ -1513,7 +1602,7 @@
         <w:spacing w:after="100"/>
       </w:pPr>
       <w:r>
-        <w:t>Extract the required flow-level and packet-level features.</w:t>
+        <w:t>Apply the same locally stored feature ordering, scaling, missing-value handling, and validation used during training.</w:t>
       </w:r>
     </w:p>
     <w:p>
@@ -1521,7 +1610,7 @@
         <w:pStyle w:val="Heading3"/>
       </w:pPr>
       <w:r>
-        <w:t>Step 5: Feature Fusion</w:t>
+        <w:t>Step 9: Baseline Prediction</w:t>
       </w:r>
     </w:p>
     <w:p>
@@ -1529,7 +1618,7 @@
         <w:spacing w:after="100"/>
       </w:pPr>
       <w:r>
-        <w:t>Align packet-derived and flow-derived observations using timestamps and network identifiers.</w:t>
+        <w:t>Run the logistic-regression baseline for comparison.</w:t>
       </w:r>
     </w:p>
     <w:p>
@@ -1537,7 +1626,7 @@
         <w:pStyle w:val="Heading3"/>
       </w:pPr>
       <w:r>
-        <w:t>Step 6: Time Windowing</w:t>
+        <w:t>Step 10: World-Model Inference</w:t>
       </w:r>
     </w:p>
     <w:p>
@@ -1545,7 +1634,7 @@
         <w:spacing w:after="100"/>
       </w:pPr>
       <w:r>
-        <w:t>Partition traffic into sequential windows. Window duration is a tunable design parameter, not a fixed SIH-mandated value.</w:t>
+        <w:t>Encode the current state/history and predict the next state using the trained temporal dynamics model.</w:t>
       </w:r>
     </w:p>
     <w:p>
@@ -1553,7 +1642,7 @@
         <w:pStyle w:val="Heading3"/>
       </w:pPr>
       <w:r>
-        <w:t>Step 7: Network-State Construction</w:t>
+        <w:t>Step 11: K-Step Rollout</w:t>
       </w:r>
     </w:p>
     <w:p>
@@ -1561,7 +1650,15 @@
         <w:spacing w:after="100"/>
       </w:pPr>
       <w:r>
-        <w:t>Convert each time window into a structured state vector and optionally a communication graph.</w:t>
+        <w:t>Feed predicted states back through the dynamics model to produce future states S_(t+1) through S_(</w:t>
+      </w:r>
+      <w:proofErr w:type="spellStart"/>
+      <w:r>
+        <w:t>t+K</w:t>
+      </w:r>
+      <w:proofErr w:type="spellEnd"/>
+      <w:r>
+        <w:t>).</w:t>
       </w:r>
     </w:p>
     <w:p>
@@ -1569,7 +1666,7 @@
         <w:pStyle w:val="Heading3"/>
       </w:pPr>
       <w:r>
-        <w:t>Step 8: Preprocessing</w:t>
+        <w:t>Step 12: Infiltration Forecast</w:t>
       </w:r>
     </w:p>
     <w:p>
@@ -1577,7 +1674,7 @@
         <w:spacing w:after="100"/>
       </w:pPr>
       <w:r>
-        <w:t>Apply the same locally stored feature ordering, scaling, missing-value handling, and validation used during training.</w:t>
+        <w:t>Convert each future state/trajectory representation into an infiltration likelihood for the corresponding future window.</w:t>
       </w:r>
     </w:p>
     <w:p>
@@ -1585,7 +1682,7 @@
         <w:pStyle w:val="Heading3"/>
       </w:pPr>
       <w:r>
-        <w:t>Step 9: Baseline Prediction</w:t>
+        <w:t>Step 13: Attack-Stage Interpretation</w:t>
       </w:r>
     </w:p>
     <w:p>
@@ -1593,7 +1690,7 @@
         <w:spacing w:after="100"/>
       </w:pPr>
       <w:r>
-        <w:t>Run the logistic-regression baseline for comparison.</w:t>
+        <w:t>Map predicted behavior to the defined attack-stage categories.</w:t>
       </w:r>
     </w:p>
     <w:p>
@@ -1601,7 +1698,7 @@
         <w:pStyle w:val="Heading3"/>
       </w:pPr>
       <w:r>
-        <w:t>Step 10: World-Model Inference</w:t>
+        <w:t>Step 14: Explainability</w:t>
       </w:r>
     </w:p>
     <w:p>
@@ -1609,7 +1706,7 @@
         <w:spacing w:after="100"/>
       </w:pPr>
       <w:r>
-        <w:t>Encode the current state/history and predict the next state using the trained temporal dynamics model.</w:t>
+        <w:t>Calculate feature contribution or attention information and identify relevant flows, ports, flags, and traffic patterns.</w:t>
       </w:r>
     </w:p>
     <w:p>
@@ -1617,7 +1714,7 @@
         <w:pStyle w:val="Heading3"/>
       </w:pPr>
       <w:r>
-        <w:t>Step 11: K-Step Rollout</w:t>
+        <w:t>Step 15: Dashboard Rendering</w:t>
       </w:r>
     </w:p>
     <w:p>
@@ -1625,7 +1722,7 @@
         <w:spacing w:after="100"/>
       </w:pPr>
       <w:r>
-        <w:t>Feed predicted states back through the dynamics model to produce future states S_(t+1) through S_(t+K).</w:t>
+        <w:t>Display the forecast timeline, predicted stage, contributing evidence, and selected traffic details.</w:t>
       </w:r>
     </w:p>
     <w:p>
@@ -1633,7 +1730,7 @@
         <w:pStyle w:val="Heading3"/>
       </w:pPr>
       <w:r>
-        <w:t>Step 12: Infiltration Forecast</w:t>
+        <w:t>Step 16: Offline Operation</w:t>
       </w:r>
     </w:p>
     <w:p>
@@ -1641,70 +1738,6 @@
         <w:spacing w:after="100"/>
       </w:pPr>
       <w:r>
-        <w:t>Convert each future state/trajectory representation into an infiltration likelihood for the corresponding future window.</w:t>
-      </w:r>
-    </w:p>
-    <w:p>
-      <w:pPr>
-        <w:pStyle w:val="Heading3"/>
-      </w:pPr>
-      <w:r>
-        <w:t>Step 13: Attack-Stage Interpretation</w:t>
-      </w:r>
-    </w:p>
-    <w:p>
-      <w:pPr>
-        <w:spacing w:after="100"/>
-      </w:pPr>
-      <w:r>
-        <w:t>Map predicted behavior to the defined attack-stage categories.</w:t>
-      </w:r>
-    </w:p>
-    <w:p>
-      <w:pPr>
-        <w:pStyle w:val="Heading3"/>
-      </w:pPr>
-      <w:r>
-        <w:t>Step 14: Explainability</w:t>
-      </w:r>
-    </w:p>
-    <w:p>
-      <w:pPr>
-        <w:spacing w:after="100"/>
-      </w:pPr>
-      <w:r>
-        <w:t>Calculate feature contribution or attention information and identify relevant flows, ports, flags, and traffic patterns.</w:t>
-      </w:r>
-    </w:p>
-    <w:p>
-      <w:pPr>
-        <w:pStyle w:val="Heading3"/>
-      </w:pPr>
-      <w:r>
-        <w:t>Step 15: Dashboard Rendering</w:t>
-      </w:r>
-    </w:p>
-    <w:p>
-      <w:pPr>
-        <w:spacing w:after="100"/>
-      </w:pPr>
-      <w:r>
-        <w:t>Display the forecast timeline, predicted stage, contributing evidence, and selected traffic details.</w:t>
-      </w:r>
-    </w:p>
-    <w:p>
-      <w:pPr>
-        <w:pStyle w:val="Heading3"/>
-      </w:pPr>
-      <w:r>
-        <w:t>Step 16: Offline Operation</w:t>
-      </w:r>
-    </w:p>
-    <w:p>
-      <w:pPr>
-        <w:spacing w:after="100"/>
-      </w:pPr>
-      <w:r>
         <w:t>All inference, mappings, preprocessing, and visualization execute locally without cloud API calls.</w:t>
       </w:r>
     </w:p>
@@ -1713,7 +1746,6 @@
         <w:pStyle w:val="Heading1"/>
       </w:pPr>
       <w:r>
-        <w:lastRenderedPageBreak/>
         <w:t>8. Proposed System Architecture</w:t>
       </w:r>
     </w:p>
@@ -1833,8 +1865,21 @@
             <w:tcW w:w="3312" w:type="dxa"/>
           </w:tcPr>
           <w:p>
-            <w:r>
-              <w:t>Scapy/PyShark, flow parser</w:t>
+            <w:proofErr w:type="spellStart"/>
+            <w:r>
+              <w:t>Scapy</w:t>
+            </w:r>
+            <w:proofErr w:type="spellEnd"/>
+            <w:r>
+              <w:t>/</w:t>
+            </w:r>
+            <w:proofErr w:type="spellStart"/>
+            <w:r>
+              <w:t>PyShark</w:t>
+            </w:r>
+            <w:proofErr w:type="spellEnd"/>
+            <w:r>
+              <w:t>, flow parser</w:t>
             </w:r>
           </w:p>
         </w:tc>
@@ -1908,7 +1953,15 @@
           </w:tcPr>
           <w:p>
             <w:r>
-              <w:t>Create S_t representations</w:t>
+              <w:t xml:space="preserve">Create </w:t>
+            </w:r>
+            <w:proofErr w:type="spellStart"/>
+            <w:r>
+              <w:t>S_t</w:t>
+            </w:r>
+            <w:proofErr w:type="spellEnd"/>
+            <w:r>
+              <w:t xml:space="preserve"> representations</w:t>
             </w:r>
           </w:p>
         </w:tc>
@@ -1920,6 +1973,7 @@
           </w:tcPr>
           <w:p>
             <w:r>
+              <w:lastRenderedPageBreak/>
               <w:t>Prediction</w:t>
             </w:r>
           </w:p>
@@ -2025,9 +2079,19 @@
             <w:tcW w:w="3312" w:type="dxa"/>
           </w:tcPr>
           <w:p>
-            <w:r>
-              <w:t>FastAPI + React or Streamlit</w:t>
-            </w:r>
+            <w:proofErr w:type="spellStart"/>
+            <w:r>
+              <w:t>FastAPI</w:t>
+            </w:r>
+            <w:proofErr w:type="spellEnd"/>
+            <w:r>
+              <w:t xml:space="preserve"> + React or </w:t>
+            </w:r>
+            <w:proofErr w:type="spellStart"/>
+            <w:r>
+              <w:t>Streamlit</w:t>
+            </w:r>
+            <w:proofErr w:type="spellEnd"/>
           </w:p>
         </w:tc>
         <w:tc>
@@ -2119,7 +2183,6 @@
         <w:pStyle w:val="Heading2"/>
       </w:pPr>
       <w:r>
-        <w:lastRenderedPageBreak/>
         <w:t>9.4 Optional Graph-Based Model — GNN + Temporal Model</w:t>
       </w:r>
     </w:p>
@@ -2128,7 +2191,15 @@
         <w:spacing w:after="100"/>
       </w:pPr>
       <w:r>
-        <w:t>If the team has sufficient implementation time, a communication graph can represent hosts as nodes and flows as edges. GraphSAGE or GAT can encode spatial/relational network structure, followed by an LSTM or Transformer for temporal dynamics. This should be treated as an advanced version rather than the starting point.</w:t>
+        <w:t xml:space="preserve">If the team has sufficient implementation time, a communication graph can represent hosts as nodes and flows as edges. </w:t>
+      </w:r>
+      <w:proofErr w:type="spellStart"/>
+      <w:r>
+        <w:t>GraphSAGE</w:t>
+      </w:r>
+      <w:proofErr w:type="spellEnd"/>
+      <w:r>
+        <w:t xml:space="preserve"> or GAT can encode spatial/relational network structure, followed by an LSTM or Transformer for temporal dynamics. This should be treated as an advanced version rather than the starting point.</w:t>
       </w:r>
     </w:p>
     <w:p>
@@ -2172,7 +2243,7 @@
         <w:spacing w:after="40"/>
       </w:pPr>
       <w:r>
-        <w:t>Optional GNN + temporal model.</w:t>
+        <w:t>GNN + temporal model.</w:t>
       </w:r>
     </w:p>
     <w:p>
@@ -2189,6 +2260,7 @@
         <w:pStyle w:val="Heading1"/>
       </w:pPr>
       <w:r>
+        <w:lastRenderedPageBreak/>
         <w:t>10. Forward Simulation and Forecasting</w:t>
       </w:r>
     </w:p>
@@ -2197,7 +2269,23 @@
         <w:spacing w:after="100"/>
       </w:pPr>
       <w:r>
-        <w:t>Let the latest observed network state be S_t. The world model predicts S_(t+1), then S_(t+2), and continues until S_(t+K). The future-state sequence is then evaluated by an infiltration prediction head.</w:t>
+        <w:t xml:space="preserve">Let the latest observed network state be </w:t>
+      </w:r>
+      <w:proofErr w:type="spellStart"/>
+      <w:r>
+        <w:t>S_t</w:t>
+      </w:r>
+      <w:proofErr w:type="spellEnd"/>
+      <w:r>
+        <w:t>. The world model predicts S_(t+1), then S_(t+2), and continues until S_(</w:t>
+      </w:r>
+      <w:proofErr w:type="spellStart"/>
+      <w:r>
+        <w:t>t+K</w:t>
+      </w:r>
+      <w:proofErr w:type="spellEnd"/>
+      <w:r>
+        <w:t>). The future-state sequence is then evaluated by an infiltration prediction head.</w:t>
       </w:r>
     </w:p>
     <w:p>
@@ -2295,7 +2383,6 @@
         <w:spacing w:after="40"/>
       </w:pPr>
       <w:r>
-        <w:lastRenderedPageBreak/>
         <w:t>Attention weights for Transformer-based models, used cautiously as supporting evidence rather than as a complete causal explanation.</w:t>
       </w:r>
     </w:p>
@@ -2365,6 +2452,7 @@
         <w:pStyle w:val="Heading1"/>
       </w:pPr>
       <w:r>
+        <w:lastRenderedPageBreak/>
         <w:t>13. Data Sources and Dataset Strategy</w:t>
       </w:r>
     </w:p>
@@ -2467,7 +2555,7 @@
           </w:tcPr>
           <w:p>
             <w:r>
-              <w:t>CIC-IDS2018</w:t>
+              <w:t>UNSW-NB15</w:t>
             </w:r>
           </w:p>
         </w:tc>
@@ -2477,7 +2565,7 @@
           </w:tcPr>
           <w:p>
             <w:r>
-              <w:t>Large network intrusion dataset with PCAP/flows</w:t>
+              <w:t>Independent intrusion dataset</w:t>
             </w:r>
           </w:p>
         </w:tc>
@@ -2487,7 +2575,7 @@
           </w:tcPr>
           <w:p>
             <w:r>
-              <w:t>Primary development dataset</w:t>
+              <w:t>Cross-dataset generalization</w:t>
             </w:r>
           </w:p>
         </w:tc>
@@ -2499,7 +2587,7 @@
           </w:tcPr>
           <w:p>
             <w:r>
-              <w:t>UNSW-NB15</w:t>
+              <w:t>CTU-13</w:t>
             </w:r>
           </w:p>
         </w:tc>
@@ -2509,7 +2597,7 @@
           </w:tcPr>
           <w:p>
             <w:r>
-              <w:t>Independent intrusion dataset</w:t>
+              <w:t>Botnet and background traffic scenarios</w:t>
             </w:r>
           </w:p>
         </w:tc>
@@ -2519,135 +2607,7 @@
           </w:tcPr>
           <w:p>
             <w:r>
-              <w:t>Cross-dataset generalization</w:t>
-            </w:r>
-          </w:p>
-        </w:tc>
-      </w:tr>
-      <w:tr>
-        <w:tc>
-          <w:tcPr>
-            <w:tcW w:w="3312" w:type="dxa"/>
-          </w:tcPr>
-          <w:p>
-            <w:r>
-              <w:t>CTU-13</w:t>
-            </w:r>
-          </w:p>
-        </w:tc>
-        <w:tc>
-          <w:tcPr>
-            <w:tcW w:w="3312" w:type="dxa"/>
-          </w:tcPr>
-          <w:p>
-            <w:r>
-              <w:t>Botnet and background traffic scenarios</w:t>
-            </w:r>
-          </w:p>
-        </w:tc>
-        <w:tc>
-          <w:tcPr>
-            <w:tcW w:w="3312" w:type="dxa"/>
-          </w:tcPr>
-          <w:p>
-            <w:r>
               <w:t>Temporal/botnet validation</w:t>
-            </w:r>
-          </w:p>
-        </w:tc>
-      </w:tr>
-      <w:tr>
-        <w:tc>
-          <w:tcPr>
-            <w:tcW w:w="3312" w:type="dxa"/>
-          </w:tcPr>
-          <w:p>
-            <w:r>
-              <w:t>CICIoT2023</w:t>
-            </w:r>
-          </w:p>
-        </w:tc>
-        <w:tc>
-          <w:tcPr>
-            <w:tcW w:w="3312" w:type="dxa"/>
-          </w:tcPr>
-          <w:p>
-            <w:r>
-              <w:t>IoT traffic and attacks</w:t>
-            </w:r>
-          </w:p>
-        </w:tc>
-        <w:tc>
-          <w:tcPr>
-            <w:tcW w:w="3312" w:type="dxa"/>
-          </w:tcPr>
-          <w:p>
-            <w:r>
-              <w:t>Optional additional generalization</w:t>
-            </w:r>
-          </w:p>
-        </w:tc>
-      </w:tr>
-      <w:tr>
-        <w:tc>
-          <w:tcPr>
-            <w:tcW w:w="3312" w:type="dxa"/>
-          </w:tcPr>
-          <w:p>
-            <w:r>
-              <w:t>LANL Authentication Dataset</w:t>
-            </w:r>
-          </w:p>
-        </w:tc>
-        <w:tc>
-          <w:tcPr>
-            <w:tcW w:w="3312" w:type="dxa"/>
-          </w:tcPr>
-          <w:p>
-            <w:r>
-              <w:t>Authentication relationships</w:t>
-            </w:r>
-          </w:p>
-        </w:tc>
-        <w:tc>
-          <w:tcPr>
-            <w:tcW w:w="3312" w:type="dxa"/>
-          </w:tcPr>
-          <w:p>
-            <w:r>
-              <w:t>Optional contextual enrichment</w:t>
-            </w:r>
-          </w:p>
-        </w:tc>
-      </w:tr>
-      <w:tr>
-        <w:tc>
-          <w:tcPr>
-            <w:tcW w:w="3312" w:type="dxa"/>
-          </w:tcPr>
-          <w:p>
-            <w:r>
-              <w:t>DARPA IDS datasets</w:t>
-            </w:r>
-          </w:p>
-        </w:tc>
-        <w:tc>
-          <w:tcPr>
-            <w:tcW w:w="3312" w:type="dxa"/>
-          </w:tcPr>
-          <w:p>
-            <w:r>
-              <w:t>Historical intrusion scenarios</w:t>
-            </w:r>
-          </w:p>
-        </w:tc>
-        <w:tc>
-          <w:tcPr>
-            <w:tcW w:w="3312" w:type="dxa"/>
-          </w:tcPr>
-          <w:p>
-            <w:r>
-              <w:t>Optional historical/trajectory validation</w:t>
             </w:r>
           </w:p>
         </w:tc>
@@ -2681,11 +2641,113 @@
     </w:p>
     <w:p>
       <w:pPr>
+        <w:pStyle w:val="Heading2"/>
+        <w:numPr>
+          <w:ilvl w:val="1"/>
+          <w:numId w:val="11"/>
+        </w:numPr>
+      </w:pPr>
+      <w:r>
+        <w:t>Recommended Dataset Progression</w:t>
+      </w:r>
+    </w:p>
+    <w:p>
+      <w:pPr>
+        <w:pStyle w:val="ListNumber"/>
+        <w:numPr>
+          <w:ilvl w:val="0"/>
+          <w:numId w:val="0"/>
+        </w:numPr>
+        <w:spacing w:after="40"/>
+      </w:pPr>
+      <w:r>
+        <w:t>1.</w:t>
+      </w:r>
+      <w:r>
+        <w:t>Develop the first pipeline using CIC-IDS201</w:t>
+      </w:r>
+      <w:r>
+        <w:t>7</w:t>
+      </w:r>
+      <w:r>
+        <w:t>.</w:t>
+      </w:r>
+    </w:p>
+    <w:p>
+      <w:pPr>
+        <w:pStyle w:val="ListNumber"/>
+        <w:numPr>
+          <w:ilvl w:val="0"/>
+          <w:numId w:val="0"/>
+        </w:numPr>
+        <w:spacing w:after="40"/>
+      </w:pPr>
+      <w:r>
+        <w:t>2.</w:t>
+      </w:r>
+      <w:r>
+        <w:t xml:space="preserve">Validate temporal behavior using </w:t>
+      </w:r>
+      <w:r>
+        <w:t>UNSW-NB15</w:t>
+      </w:r>
+      <w:r>
+        <w:t>.</w:t>
+      </w:r>
+    </w:p>
+    <w:p>
+      <w:pPr>
+        <w:pStyle w:val="ListNumber"/>
+        <w:numPr>
+          <w:ilvl w:val="0"/>
+          <w:numId w:val="0"/>
+        </w:numPr>
+        <w:spacing w:after="40"/>
+      </w:pPr>
+      <w:r>
+        <w:t>3.</w:t>
+      </w:r>
+      <w:r>
+        <w:t>Use CTU-13 for additional temporal/botnet validation.</w:t>
+      </w:r>
+    </w:p>
+    <w:p>
+      <w:pPr>
+        <w:spacing w:after="100"/>
+      </w:pPr>
+      <w:r>
+        <w:t>The project should preserve the distinction between traffic datasets and knowledge bases. MITRE ATT&amp;CK</w:t>
+      </w:r>
+      <w:r>
+        <w:t xml:space="preserve"> and</w:t>
+      </w:r>
+      <w:r>
+        <w:t xml:space="preserve"> CAPEC are not substitutes for network traffic used to train the temporal world model.</w:t>
+      </w:r>
+    </w:p>
+    <w:p>
+      <w:pPr>
+        <w:pStyle w:val="Heading1"/>
+      </w:pPr>
+      <w:r>
+        <w:t>14. Data Processing Pipeline</w:t>
+      </w:r>
+    </w:p>
+    <w:p>
+      <w:pPr>
+        <w:pStyle w:val="Heading2"/>
+      </w:pPr>
+      <w:r>
+        <w:t>14.1 Raw Data</w:t>
+      </w:r>
+    </w:p>
+    <w:p>
+      <w:pPr>
         <w:pStyle w:val="ListBullet"/>
         <w:spacing w:after="40"/>
       </w:pPr>
       <w:r>
-        <w:t>CVE/NVD — vulnerability context and enrichment where relevant.</w:t>
+        <w:t>PCAP files.</w:t>
       </w:r>
     </w:p>
     <w:p>
@@ -2694,85 +2756,7 @@
         <w:spacing w:after="40"/>
       </w:pPr>
       <w:r>
-        <w:t>Other open cybersecurity resources where licensing and data-use conditions permit.</w:t>
-      </w:r>
-    </w:p>
-    <w:p>
-      <w:pPr>
-        <w:pStyle w:val="Heading2"/>
-      </w:pPr>
-      <w:r>
-        <w:t>13.3 Recommended Dataset Progression</w:t>
-      </w:r>
-    </w:p>
-    <w:p>
-      <w:pPr>
-        <w:pStyle w:val="ListNumber"/>
-        <w:spacing w:after="40"/>
-      </w:pPr>
-      <w:r>
-        <w:t>Develop the first pipeline using CIC-IDS2018.</w:t>
-      </w:r>
-    </w:p>
-    <w:p>
-      <w:pPr>
-        <w:pStyle w:val="ListNumber"/>
-        <w:spacing w:after="40"/>
-      </w:pPr>
-      <w:r>
-        <w:t>Validate temporal behavior using CIC-IDS2017.</w:t>
-      </w:r>
-    </w:p>
-    <w:p>
-      <w:pPr>
-        <w:pStyle w:val="ListNumber"/>
-        <w:spacing w:after="40"/>
-      </w:pPr>
-      <w:r>
-        <w:t>Test cross-dataset generalization using UNSW-NB15.</w:t>
-      </w:r>
-    </w:p>
-    <w:p>
-      <w:pPr>
-        <w:pStyle w:val="ListNumber"/>
-        <w:spacing w:after="40"/>
-      </w:pPr>
-      <w:r>
-        <w:t>Use CTU-13 for additional temporal/botnet validation.</w:t>
-      </w:r>
-    </w:p>
-    <w:p>
-      <w:pPr>
-        <w:pStyle w:val="ListNumber"/>
-        <w:spacing w:after="40"/>
-      </w:pPr>
-      <w:r>
-        <w:t>Use other datasets only when they answer a defined experimental question.</w:t>
-      </w:r>
-    </w:p>
-    <w:p>
-      <w:pPr>
-        <w:spacing w:after="100"/>
-      </w:pPr>
-      <w:r>
-        <w:t>The project should preserve the distinction between traffic datasets and knowledge bases. MITRE ATT&amp;CK, CAPEC, and NVD are not substitutes for network traffic used to train the temporal world model.</w:t>
-      </w:r>
-    </w:p>
-    <w:p>
-      <w:pPr>
-        <w:pStyle w:val="Heading1"/>
-      </w:pPr>
-      <w:r>
-        <w:lastRenderedPageBreak/>
-        <w:t>14. Data Processing Pipeline</w:t>
-      </w:r>
-    </w:p>
-    <w:p>
-      <w:pPr>
-        <w:pStyle w:val="Heading2"/>
-      </w:pPr>
-      <w:r>
-        <w:t>14.1 Raw Data</w:t>
+        <w:t>Flow CSV/NetFlow/IPFIX-style records.</w:t>
       </w:r>
     </w:p>
     <w:p>
@@ -2781,7 +2765,182 @@
         <w:spacing w:after="40"/>
       </w:pPr>
       <w:r>
-        <w:t>PCAP files.</w:t>
+        <w:t>Optional host/authentication data for enrichment.</w:t>
+      </w:r>
+    </w:p>
+    <w:p>
+      <w:pPr>
+        <w:pStyle w:val="Heading2"/>
+        <w:numPr>
+          <w:ilvl w:val="1"/>
+          <w:numId w:val="12"/>
+        </w:numPr>
+      </w:pPr>
+      <w:r>
+        <w:t>Processing</w:t>
+      </w:r>
+    </w:p>
+    <w:p>
+      <w:pPr>
+        <w:pStyle w:val="ListNumber"/>
+        <w:numPr>
+          <w:ilvl w:val="0"/>
+          <w:numId w:val="0"/>
+        </w:numPr>
+        <w:spacing w:after="40"/>
+      </w:pPr>
+      <w:r>
+        <w:t>1.</w:t>
+      </w:r>
+      <w:r>
+        <w:t>Validate timestamps and required columns.</w:t>
+      </w:r>
+    </w:p>
+    <w:p>
+      <w:pPr>
+        <w:pStyle w:val="ListNumber"/>
+        <w:numPr>
+          <w:ilvl w:val="0"/>
+          <w:numId w:val="0"/>
+        </w:numPr>
+        <w:spacing w:after="40"/>
+      </w:pPr>
+      <w:r>
+        <w:t>2.</w:t>
+      </w:r>
+      <w:r>
+        <w:t>Parse packets and/or flow records.</w:t>
+      </w:r>
+    </w:p>
+    <w:p>
+      <w:pPr>
+        <w:pStyle w:val="ListNumber"/>
+        <w:numPr>
+          <w:ilvl w:val="0"/>
+          <w:numId w:val="0"/>
+        </w:numPr>
+        <w:spacing w:after="40"/>
+      </w:pPr>
+      <w:r>
+        <w:t>3.</w:t>
+      </w:r>
+      <w:r>
+        <w:t>Extract required features.</w:t>
+      </w:r>
+    </w:p>
+    <w:p>
+      <w:pPr>
+        <w:pStyle w:val="ListNumber"/>
+        <w:numPr>
+          <w:ilvl w:val="0"/>
+          <w:numId w:val="0"/>
+        </w:numPr>
+        <w:spacing w:after="40"/>
+      </w:pPr>
+      <w:r>
+        <w:t>4.</w:t>
+      </w:r>
+      <w:r>
+        <w:t>Handle missing and invalid values.</w:t>
+      </w:r>
+    </w:p>
+    <w:p>
+      <w:pPr>
+        <w:pStyle w:val="ListNumber"/>
+        <w:numPr>
+          <w:ilvl w:val="0"/>
+          <w:numId w:val="0"/>
+        </w:numPr>
+        <w:spacing w:after="40"/>
+      </w:pPr>
+      <w:r>
+        <w:t>5.</w:t>
+      </w:r>
+      <w:r>
+        <w:t>Normalize feature scales using training-time parameters.</w:t>
+      </w:r>
+    </w:p>
+    <w:p>
+      <w:pPr>
+        <w:pStyle w:val="ListNumber"/>
+        <w:numPr>
+          <w:ilvl w:val="0"/>
+          <w:numId w:val="0"/>
+        </w:numPr>
+        <w:spacing w:after="40"/>
+        <w:ind w:left="360" w:hanging="360"/>
+      </w:pPr>
+      <w:r>
+        <w:t>6.</w:t>
+      </w:r>
+      <w:r>
+        <w:t>Create chronological windows.</w:t>
+      </w:r>
+    </w:p>
+    <w:p>
+      <w:pPr>
+        <w:pStyle w:val="ListNumber"/>
+        <w:numPr>
+          <w:ilvl w:val="0"/>
+          <w:numId w:val="0"/>
+        </w:numPr>
+        <w:spacing w:after="40"/>
+      </w:pPr>
+      <w:r>
+        <w:t>7.</w:t>
+      </w:r>
+      <w:r>
+        <w:t>Construct network states.</w:t>
+      </w:r>
+    </w:p>
+    <w:p>
+      <w:pPr>
+        <w:pStyle w:val="ListNumber"/>
+        <w:numPr>
+          <w:ilvl w:val="0"/>
+          <w:numId w:val="0"/>
+        </w:numPr>
+        <w:spacing w:after="40"/>
+        <w:ind w:left="360" w:hanging="360"/>
+      </w:pPr>
+      <w:r>
+        <w:t>8.</w:t>
+      </w:r>
+      <w:r>
+        <w:t>Generate sequence samples for world-model training.</w:t>
+      </w:r>
+    </w:p>
+    <w:p>
+      <w:pPr>
+        <w:pStyle w:val="ListNumber"/>
+        <w:numPr>
+          <w:ilvl w:val="0"/>
+          <w:numId w:val="0"/>
+        </w:numPr>
+        <w:spacing w:after="40"/>
+        <w:ind w:left="360" w:hanging="360"/>
+      </w:pPr>
+      <w:r>
+        <w:t>9.</w:t>
+      </w:r>
+      <w:r>
+        <w:t>Generate future-state labels and attack-stage labels according to the experimental protocol.</w:t>
+      </w:r>
+    </w:p>
+    <w:p>
+      <w:pPr>
+        <w:pStyle w:val="Heading1"/>
+      </w:pPr>
+      <w:r>
+        <w:t>15. Ground Truth and Labeling Strategy</w:t>
+      </w:r>
+    </w:p>
+    <w:p>
+      <w:pPr>
+        <w:spacing w:after="100"/>
+      </w:pPr>
+      <w:r>
+        <w:t>The most important research-design issue is defining what constitutes a correct forecast. The system should not simply shuffle individual flows and train a static classifier.</w:t>
       </w:r>
     </w:p>
     <w:p>
@@ -2790,7 +2949,7 @@
         <w:spacing w:after="40"/>
       </w:pPr>
       <w:r>
-        <w:t>Flow CSV/NetFlow/IPFIX-style records.</w:t>
+        <w:t>Preserve chronological order within each scenario.</w:t>
       </w:r>
     </w:p>
     <w:p>
@@ -2799,112 +2958,7 @@
         <w:spacing w:after="40"/>
       </w:pPr>
       <w:r>
-        <w:t>Optional host/authentication data for enrichment.</w:t>
-      </w:r>
-    </w:p>
-    <w:p>
-      <w:pPr>
-        <w:pStyle w:val="Heading2"/>
-      </w:pPr>
-      <w:r>
-        <w:t>14.2 Processing</w:t>
-      </w:r>
-    </w:p>
-    <w:p>
-      <w:pPr>
-        <w:pStyle w:val="ListNumber"/>
-        <w:spacing w:after="40"/>
-      </w:pPr>
-      <w:r>
-        <w:t>Validate timestamps and required columns.</w:t>
-      </w:r>
-    </w:p>
-    <w:p>
-      <w:pPr>
-        <w:pStyle w:val="ListNumber"/>
-        <w:spacing w:after="40"/>
-      </w:pPr>
-      <w:r>
-        <w:t>Parse packets and/or flow records.</w:t>
-      </w:r>
-    </w:p>
-    <w:p>
-      <w:pPr>
-        <w:pStyle w:val="ListNumber"/>
-        <w:spacing w:after="40"/>
-      </w:pPr>
-      <w:r>
-        <w:t>Extract required features.</w:t>
-      </w:r>
-    </w:p>
-    <w:p>
-      <w:pPr>
-        <w:pStyle w:val="ListNumber"/>
-        <w:spacing w:after="40"/>
-      </w:pPr>
-      <w:r>
-        <w:t>Handle missing and invalid values.</w:t>
-      </w:r>
-    </w:p>
-    <w:p>
-      <w:pPr>
-        <w:pStyle w:val="ListNumber"/>
-        <w:spacing w:after="40"/>
-      </w:pPr>
-      <w:r>
-        <w:t>Normalize feature scales using training-time parameters.</w:t>
-      </w:r>
-    </w:p>
-    <w:p>
-      <w:pPr>
-        <w:pStyle w:val="ListNumber"/>
-        <w:spacing w:after="40"/>
-      </w:pPr>
-      <w:r>
-        <w:t>Create chronological windows.</w:t>
-      </w:r>
-    </w:p>
-    <w:p>
-      <w:pPr>
-        <w:pStyle w:val="ListNumber"/>
-        <w:spacing w:after="40"/>
-      </w:pPr>
-      <w:r>
-        <w:t>Construct network states.</w:t>
-      </w:r>
-    </w:p>
-    <w:p>
-      <w:pPr>
-        <w:pStyle w:val="ListNumber"/>
-        <w:spacing w:after="40"/>
-      </w:pPr>
-      <w:r>
-        <w:t>Generate sequence samples for world-model training.</w:t>
-      </w:r>
-    </w:p>
-    <w:p>
-      <w:pPr>
-        <w:pStyle w:val="ListNumber"/>
-        <w:spacing w:after="40"/>
-      </w:pPr>
-      <w:r>
-        <w:t>Generate future-state labels and attack-stage labels according to the experimental protocol.</w:t>
-      </w:r>
-    </w:p>
-    <w:p>
-      <w:pPr>
-        <w:pStyle w:val="Heading1"/>
-      </w:pPr>
-      <w:r>
-        <w:t>15. Ground Truth and Labeling Strategy</w:t>
-      </w:r>
-    </w:p>
-    <w:p>
-      <w:pPr>
-        <w:spacing w:after="100"/>
-      </w:pPr>
-      <w:r>
-        <w:t>The most important research-design issue is defining what constitutes a correct forecast. The system should not simply shuffle individual flows and train a static classifier.</w:t>
+        <w:t>Define a fixed or tunable observation window.</w:t>
       </w:r>
     </w:p>
     <w:p>
@@ -2913,7 +2967,8 @@
         <w:spacing w:after="40"/>
       </w:pPr>
       <w:r>
-        <w:t>Preserve chronological order within each scenario.</w:t>
+        <w:lastRenderedPageBreak/>
+        <w:t>Define a future horizon K.</w:t>
       </w:r>
     </w:p>
     <w:p>
@@ -2922,7 +2977,7 @@
         <w:spacing w:after="40"/>
       </w:pPr>
       <w:r>
-        <w:t>Define a fixed or tunable observation window.</w:t>
+        <w:t>Construct the current state from observations up to time t.</w:t>
       </w:r>
     </w:p>
     <w:p>
@@ -2931,7 +2986,7 @@
         <w:spacing w:after="40"/>
       </w:pPr>
       <w:r>
-        <w:t>Define a future horizon K.</w:t>
+        <w:t>Construct future-state targets from observations after t.</w:t>
       </w:r>
     </w:p>
     <w:p>
@@ -2940,7 +2995,7 @@
         <w:spacing w:after="40"/>
       </w:pPr>
       <w:r>
-        <w:t>Construct the current state from observations up to time t.</w:t>
+        <w:t>Define the infiltration/attack-stage target consistently across the dataset.</w:t>
       </w:r>
     </w:p>
     <w:p>
@@ -2949,7 +3004,7 @@
         <w:spacing w:after="40"/>
       </w:pPr>
       <w:r>
-        <w:t>Construct future-state targets from observations after t.</w:t>
+        <w:t>Prevent future information from leaking into the current-state features.</w:t>
       </w:r>
     </w:p>
     <w:p>
@@ -2958,24 +3013,6 @@
         <w:spacing w:after="40"/>
       </w:pPr>
       <w:r>
-        <w:t>Define the infiltration/attack-stage target consistently across the dataset.</w:t>
-      </w:r>
-    </w:p>
-    <w:p>
-      <w:pPr>
-        <w:pStyle w:val="ListBullet"/>
-        <w:spacing w:after="40"/>
-      </w:pPr>
-      <w:r>
-        <w:t>Prevent future information from leaking into the current-state features.</w:t>
-      </w:r>
-    </w:p>
-    <w:p>
-      <w:pPr>
-        <w:pStyle w:val="ListBullet"/>
-        <w:spacing w:after="40"/>
-      </w:pPr>
-      <w:r>
         <w:t>Keep train/validation/test periods separated chronologically where possible.</w:t>
       </w:r>
     </w:p>
@@ -3000,7 +3037,7 @@
         <w:pStyle w:val="Heading2"/>
       </w:pPr>
       <w:r>
-        <w:t>16.1 SIH-Aligned Metrics</w:t>
+        <w:t>16.1 Metrics</w:t>
       </w:r>
     </w:p>
     <w:tbl>
@@ -3153,7 +3190,6 @@
         <w:spacing w:after="40"/>
       </w:pPr>
       <w:r>
-        <w:lastRenderedPageBreak/>
         <w:t>Forecast lead time, where a meaningful warning occurs before observed progression.</w:t>
       </w:r>
     </w:p>
@@ -3292,7 +3328,24 @@
         <w:spacing w:after="40"/>
       </w:pPr>
       <w:r>
-        <w:t>Local FastAPI/Streamlit/React application.</w:t>
+        <w:lastRenderedPageBreak/>
+        <w:t xml:space="preserve">Local </w:t>
+      </w:r>
+      <w:proofErr w:type="spellStart"/>
+      <w:r>
+        <w:t>FastAPI</w:t>
+      </w:r>
+      <w:proofErr w:type="spellEnd"/>
+      <w:r>
+        <w:t>/</w:t>
+      </w:r>
+      <w:proofErr w:type="spellStart"/>
+      <w:r>
+        <w:t>Streamlit</w:t>
+      </w:r>
+      <w:proofErr w:type="spellEnd"/>
+      <w:r>
+        <w:t>/React application.</w:t>
       </w:r>
     </w:p>
     <w:p>
@@ -3307,25 +3360,44 @@
     <w:p>
       <w:pPr>
         <w:pStyle w:val="Heading2"/>
-      </w:pPr>
-      <w:r>
-        <w:t>17.3 Offline Demonstration</w:t>
+        <w:numPr>
+          <w:ilvl w:val="1"/>
+          <w:numId w:val="13"/>
+        </w:numPr>
+      </w:pPr>
+      <w:r>
+        <w:t>Offline Demonstration</w:t>
       </w:r>
     </w:p>
     <w:p>
       <w:pPr>
         <w:pStyle w:val="ListNumber"/>
+        <w:numPr>
+          <w:ilvl w:val="0"/>
+          <w:numId w:val="0"/>
+        </w:numPr>
         <w:spacing w:after="40"/>
       </w:pPr>
       <w:r>
+        <w:t>1.</w:t>
+      </w:r>
+      <w:r>
         <w:t>Disconnect the demonstration machine from the Internet.</w:t>
       </w:r>
     </w:p>
     <w:p>
       <w:pPr>
         <w:pStyle w:val="ListNumber"/>
+        <w:numPr>
+          <w:ilvl w:val="0"/>
+          <w:numId w:val="0"/>
+        </w:numPr>
         <w:spacing w:after="40"/>
-      </w:pPr>
+        <w:ind w:left="360" w:hanging="360"/>
+      </w:pPr>
+      <w:r>
+        <w:t>2.</w:t>
+      </w:r>
       <w:r>
         <w:t>Start the local application.</w:t>
       </w:r>
@@ -3333,8 +3405,16 @@
     <w:p>
       <w:pPr>
         <w:pStyle w:val="ListNumber"/>
+        <w:numPr>
+          <w:ilvl w:val="0"/>
+          <w:numId w:val="0"/>
+        </w:numPr>
         <w:spacing w:after="40"/>
-      </w:pPr>
+        <w:ind w:left="360" w:hanging="360"/>
+      </w:pPr>
+      <w:r>
+        <w:t>3.</w:t>
+      </w:r>
       <w:r>
         <w:t>Load a locally stored PCAP or flow file.</w:t>
       </w:r>
@@ -3342,8 +3422,16 @@
     <w:p>
       <w:pPr>
         <w:pStyle w:val="ListNumber"/>
+        <w:numPr>
+          <w:ilvl w:val="0"/>
+          <w:numId w:val="0"/>
+        </w:numPr>
         <w:spacing w:after="40"/>
-      </w:pPr>
+        <w:ind w:left="360" w:hanging="360"/>
+      </w:pPr>
+      <w:r>
+        <w:t>4.</w:t>
+      </w:r>
       <w:r>
         <w:t>Run packet/flow extraction locally.</w:t>
       </w:r>
@@ -3351,8 +3439,16 @@
     <w:p>
       <w:pPr>
         <w:pStyle w:val="ListNumber"/>
+        <w:numPr>
+          <w:ilvl w:val="0"/>
+          <w:numId w:val="0"/>
+        </w:numPr>
         <w:spacing w:after="40"/>
-      </w:pPr>
+        <w:ind w:left="360" w:hanging="360"/>
+      </w:pPr>
+      <w:r>
+        <w:t>5.</w:t>
+      </w:r>
       <w:r>
         <w:t>Construct time windows and network states.</w:t>
       </w:r>
@@ -3360,8 +3456,16 @@
     <w:p>
       <w:pPr>
         <w:pStyle w:val="ListNumber"/>
+        <w:numPr>
+          <w:ilvl w:val="0"/>
+          <w:numId w:val="0"/>
+        </w:numPr>
         <w:spacing w:after="40"/>
-      </w:pPr>
+        <w:ind w:left="360" w:hanging="360"/>
+      </w:pPr>
+      <w:r>
+        <w:t>6.</w:t>
+      </w:r>
       <w:r>
         <w:t>Run the local world model.</w:t>
       </w:r>
@@ -3369,8 +3473,16 @@
     <w:p>
       <w:pPr>
         <w:pStyle w:val="ListNumber"/>
+        <w:numPr>
+          <w:ilvl w:val="0"/>
+          <w:numId w:val="0"/>
+        </w:numPr>
         <w:spacing w:after="40"/>
-      </w:pPr>
+        <w:ind w:left="360" w:hanging="360"/>
+      </w:pPr>
+      <w:r>
+        <w:t>7.</w:t>
+      </w:r>
       <w:r>
         <w:t>Perform K-step rollout.</w:t>
       </w:r>
@@ -3378,8 +3490,16 @@
     <w:p>
       <w:pPr>
         <w:pStyle w:val="ListNumber"/>
+        <w:numPr>
+          <w:ilvl w:val="0"/>
+          <w:numId w:val="0"/>
+        </w:numPr>
         <w:spacing w:after="40"/>
-      </w:pPr>
+        <w:ind w:left="360" w:hanging="360"/>
+      </w:pPr>
+      <w:r>
+        <w:t>8.</w:t>
+      </w:r>
       <w:r>
         <w:t>Generate the infiltration-likelihood timeline.</w:t>
       </w:r>
@@ -3387,8 +3507,16 @@
     <w:p>
       <w:pPr>
         <w:pStyle w:val="ListNumber"/>
+        <w:numPr>
+          <w:ilvl w:val="0"/>
+          <w:numId w:val="0"/>
+        </w:numPr>
         <w:spacing w:after="40"/>
-      </w:pPr>
+        <w:ind w:left="360" w:hanging="360"/>
+      </w:pPr>
+      <w:r>
+        <w:t>9.</w:t>
+      </w:r>
       <w:r>
         <w:t>Display attack-stage interpretation.</w:t>
       </w:r>
@@ -3396,8 +3524,16 @@
     <w:p>
       <w:pPr>
         <w:pStyle w:val="ListNumber"/>
+        <w:numPr>
+          <w:ilvl w:val="0"/>
+          <w:numId w:val="0"/>
+        </w:numPr>
         <w:spacing w:after="40"/>
-      </w:pPr>
+        <w:ind w:left="360" w:hanging="360"/>
+      </w:pPr>
+      <w:r>
+        <w:t>10.</w:t>
+      </w:r>
       <w:r>
         <w:t>Display contributing features and flows.</w:t>
       </w:r>
@@ -3510,9 +3646,19 @@
             <w:tcW w:w="3312" w:type="dxa"/>
           </w:tcPr>
           <w:p>
-            <w:r>
-              <w:t>Scapy / PyShark</w:t>
-            </w:r>
+            <w:proofErr w:type="spellStart"/>
+            <w:r>
+              <w:t>Scapy</w:t>
+            </w:r>
+            <w:proofErr w:type="spellEnd"/>
+            <w:r>
+              <w:t xml:space="preserve"> / </w:t>
+            </w:r>
+            <w:proofErr w:type="spellStart"/>
+            <w:r>
+              <w:t>PyShark</w:t>
+            </w:r>
+            <w:proofErr w:type="spellEnd"/>
           </w:p>
         </w:tc>
         <w:tc>
@@ -3543,11 +3689,7 @@
           </w:tcPr>
           <w:p>
             <w:r>
-              <w:t xml:space="preserve">Pandas / NumPy / optional </w:t>
-            </w:r>
-            <w:r>
-              <w:lastRenderedPageBreak/>
-              <w:t>Polars</w:t>
+              <w:t>Pandas / NumPy / optional Polars</w:t>
             </w:r>
           </w:p>
         </w:tc>
@@ -3557,12 +3699,7 @@
           </w:tcPr>
           <w:p>
             <w:r>
-              <w:lastRenderedPageBreak/>
-              <w:t xml:space="preserve">Feature engineering and </w:t>
-            </w:r>
-            <w:r>
-              <w:lastRenderedPageBreak/>
-              <w:t>dataset processing</w:t>
+              <w:t>Feature engineering and dataset processing</w:t>
             </w:r>
           </w:p>
         </w:tc>
@@ -3574,7 +3711,6 @@
           </w:tcPr>
           <w:p>
             <w:r>
-              <w:lastRenderedPageBreak/>
               <w:t>ML</w:t>
             </w:r>
           </w:p>
@@ -3584,9 +3720,11 @@
             <w:tcW w:w="3312" w:type="dxa"/>
           </w:tcPr>
           <w:p>
+            <w:proofErr w:type="spellStart"/>
             <w:r>
               <w:t>PyTorch</w:t>
             </w:r>
+            <w:proofErr w:type="spellEnd"/>
           </w:p>
         </w:tc>
         <w:tc>
@@ -3648,8 +3786,13 @@
             <w:tcW w:w="3312" w:type="dxa"/>
           </w:tcPr>
           <w:p>
-            <w:r>
-              <w:t>PyTorch Geometric</w:t>
+            <w:proofErr w:type="spellStart"/>
+            <w:r>
+              <w:t>PyTorch</w:t>
+            </w:r>
+            <w:proofErr w:type="spellEnd"/>
+            <w:r>
+              <w:t xml:space="preserve"> Geometric</w:t>
             </w:r>
           </w:p>
         </w:tc>
@@ -3712,9 +3855,11 @@
             <w:tcW w:w="3312" w:type="dxa"/>
           </w:tcPr>
           <w:p>
+            <w:proofErr w:type="spellStart"/>
             <w:r>
               <w:t>FastAPI</w:t>
             </w:r>
+            <w:proofErr w:type="spellEnd"/>
           </w:p>
         </w:tc>
         <w:tc>
@@ -3776,9 +3921,11 @@
             <w:tcW w:w="3312" w:type="dxa"/>
           </w:tcPr>
           <w:p>
+            <w:proofErr w:type="spellStart"/>
             <w:r>
               <w:t>Streamlit</w:t>
             </w:r>
+            <w:proofErr w:type="spellEnd"/>
           </w:p>
         </w:tc>
         <w:tc>
@@ -3809,8 +3956,13 @@
           </w:tcPr>
           <w:p>
             <w:r>
-              <w:t>PostgreSQL / optional TimescaleDB</w:t>
-            </w:r>
+              <w:t xml:space="preserve">PostgreSQL / optional </w:t>
+            </w:r>
+            <w:proofErr w:type="spellStart"/>
+            <w:r>
+              <w:t>TimescaleDB</w:t>
+            </w:r>
+            <w:proofErr w:type="spellEnd"/>
           </w:p>
         </w:tc>
         <w:tc>
@@ -3840,8 +3992,13 @@
             <w:tcW w:w="3312" w:type="dxa"/>
           </w:tcPr>
           <w:p>
-            <w:r>
-              <w:t>Plotly / React charts</w:t>
+            <w:proofErr w:type="spellStart"/>
+            <w:r>
+              <w:t>Plotly</w:t>
+            </w:r>
+            <w:proofErr w:type="spellEnd"/>
+            <w:r>
+              <w:t xml:space="preserve"> / React charts</w:t>
             </w:r>
           </w:p>
         </w:tc>
@@ -3893,261 +4050,16 @@
       <w:pPr>
         <w:pStyle w:val="Heading1"/>
       </w:pPr>
-      <w:r>
-        <w:t>19. Suggested Project Structure</w:t>
-      </w:r>
-    </w:p>
-    <w:p>
-      <w:r>
-        <w:rPr>
-          <w:rFonts w:ascii="Consolas" w:hAnsi="Consolas"/>
-        </w:rPr>
-        <w:t>SIH26153/</w:t>
-      </w:r>
-      <w:r>
-        <w:rPr>
-          <w:rFonts w:ascii="Consolas" w:hAnsi="Consolas"/>
-        </w:rPr>
-        <w:br/>
-        <w:t>├── data/</w:t>
-      </w:r>
-      <w:r>
-        <w:rPr>
-          <w:rFonts w:ascii="Consolas" w:hAnsi="Consolas"/>
-        </w:rPr>
-        <w:br/>
-        <w:t>│   ├── raw/</w:t>
-      </w:r>
-      <w:r>
-        <w:rPr>
-          <w:rFonts w:ascii="Consolas" w:hAnsi="Consolas"/>
-        </w:rPr>
-        <w:br/>
-        <w:t>│   ├── processed/</w:t>
-      </w:r>
-      <w:r>
-        <w:rPr>
-          <w:rFonts w:ascii="Consolas" w:hAnsi="Consolas"/>
-        </w:rPr>
-        <w:br/>
-        <w:t>│   └── demo/</w:t>
-      </w:r>
-      <w:r>
-        <w:rPr>
-          <w:rFonts w:ascii="Consolas" w:hAnsi="Consolas"/>
-        </w:rPr>
-        <w:br/>
-        <w:t>├── models/</w:t>
-      </w:r>
-      <w:r>
-        <w:rPr>
-          <w:rFonts w:ascii="Consolas" w:hAnsi="Consolas"/>
-        </w:rPr>
-        <w:br/>
-        <w:t>│   ├── baseline/</w:t>
-      </w:r>
-      <w:r>
-        <w:rPr>
-          <w:rFonts w:ascii="Consolas" w:hAnsi="Consolas"/>
-        </w:rPr>
-        <w:br/>
-        <w:t>│   ├── world_model/</w:t>
-      </w:r>
-      <w:r>
-        <w:rPr>
-          <w:rFonts w:ascii="Consolas" w:hAnsi="Consolas"/>
-        </w:rPr>
-        <w:br/>
-        <w:t>│   └── artifacts/</w:t>
-      </w:r>
-      <w:r>
-        <w:rPr>
-          <w:rFonts w:ascii="Consolas" w:hAnsi="Consolas"/>
-        </w:rPr>
-        <w:br/>
-        <w:t>├── knowledge/</w:t>
-      </w:r>
-      <w:r>
-        <w:rPr>
-          <w:rFonts w:ascii="Consolas" w:hAnsi="Consolas"/>
-        </w:rPr>
-        <w:br/>
-        <w:t>│   ├── mitre/</w:t>
-      </w:r>
-      <w:r>
-        <w:rPr>
-          <w:rFonts w:ascii="Consolas" w:hAnsi="Consolas"/>
-        </w:rPr>
-        <w:br/>
-        <w:t>│   ├── capec/</w:t>
-      </w:r>
-      <w:r>
-        <w:rPr>
-          <w:rFonts w:ascii="Consolas" w:hAnsi="Consolas"/>
-        </w:rPr>
-        <w:br/>
-        <w:t>│   └── nvd/</w:t>
-      </w:r>
-      <w:r>
-        <w:rPr>
-          <w:rFonts w:ascii="Consolas" w:hAnsi="Consolas"/>
-        </w:rPr>
-        <w:br/>
-        <w:t>├── src/</w:t>
-      </w:r>
-      <w:r>
-        <w:rPr>
-          <w:rFonts w:ascii="Consolas" w:hAnsi="Consolas"/>
-        </w:rPr>
-        <w:br/>
-        <w:t>│   ├── ingestion/</w:t>
-      </w:r>
-      <w:r>
-        <w:rPr>
-          <w:rFonts w:ascii="Consolas" w:hAnsi="Consolas"/>
-        </w:rPr>
-        <w:br/>
-        <w:t>│   ├── packet_features/</w:t>
-      </w:r>
-      <w:r>
-        <w:rPr>
-          <w:rFonts w:ascii="Consolas" w:hAnsi="Consolas"/>
-        </w:rPr>
-        <w:br/>
-        <w:t>│   ├── flow_features/</w:t>
-      </w:r>
-      <w:r>
-        <w:rPr>
-          <w:rFonts w:ascii="Consolas" w:hAnsi="Consolas"/>
-        </w:rPr>
-        <w:br/>
-        <w:t>│   ├── fusion/</w:t>
-      </w:r>
-      <w:r>
-        <w:rPr>
-          <w:rFonts w:ascii="Consolas" w:hAnsi="Consolas"/>
-        </w:rPr>
-        <w:br/>
-        <w:t>│   ├── windowing/</w:t>
-      </w:r>
-      <w:r>
-        <w:rPr>
-          <w:rFonts w:ascii="Consolas" w:hAnsi="Consolas"/>
-        </w:rPr>
-        <w:br/>
-        <w:t>│   ├── state_builder/</w:t>
-      </w:r>
-      <w:r>
-        <w:rPr>
-          <w:rFonts w:ascii="Consolas" w:hAnsi="Consolas"/>
-        </w:rPr>
-        <w:br/>
-        <w:t>│   ├── graph/</w:t>
-      </w:r>
-      <w:r>
-        <w:rPr>
-          <w:rFonts w:ascii="Consolas" w:hAnsi="Consolas"/>
-        </w:rPr>
-        <w:br/>
-        <w:t>│   ├── models/</w:t>
-      </w:r>
-      <w:r>
-        <w:rPr>
-          <w:rFonts w:ascii="Consolas" w:hAnsi="Consolas"/>
-        </w:rPr>
-        <w:br/>
-        <w:t>│   ├── forecasting/</w:t>
-      </w:r>
-      <w:r>
-        <w:rPr>
-          <w:rFonts w:ascii="Consolas" w:hAnsi="Consolas"/>
-        </w:rPr>
-        <w:br/>
-        <w:t>│   ├── attack_mapping/</w:t>
-      </w:r>
-      <w:r>
-        <w:rPr>
-          <w:rFonts w:ascii="Consolas" w:hAnsi="Consolas"/>
-        </w:rPr>
-        <w:br/>
-        <w:t>│   ├── explainability/</w:t>
-      </w:r>
-      <w:r>
-        <w:rPr>
-          <w:rFonts w:ascii="Consolas" w:hAnsi="Consolas"/>
-        </w:rPr>
-        <w:br/>
-        <w:t>│   └── evaluation/</w:t>
-      </w:r>
-      <w:r>
-        <w:rPr>
-          <w:rFonts w:ascii="Consolas" w:hAnsi="Consolas"/>
-        </w:rPr>
-        <w:br/>
-        <w:t>├── app/</w:t>
-      </w:r>
-      <w:r>
-        <w:rPr>
-          <w:rFonts w:ascii="Consolas" w:hAnsi="Consolas"/>
-        </w:rPr>
-        <w:br/>
-        <w:t>│   ├── api/</w:t>
-      </w:r>
-      <w:r>
-        <w:rPr>
-          <w:rFonts w:ascii="Consolas" w:hAnsi="Consolas"/>
-        </w:rPr>
-        <w:br/>
-      </w:r>
-      <w:r>
-        <w:rPr>
-          <w:rFonts w:ascii="Consolas" w:hAnsi="Consolas"/>
-        </w:rPr>
-        <w:lastRenderedPageBreak/>
-        <w:t>│   └── dashboard/</w:t>
-      </w:r>
-      <w:r>
-        <w:rPr>
-          <w:rFonts w:ascii="Consolas" w:hAnsi="Consolas"/>
-        </w:rPr>
-        <w:br/>
-        <w:t>├── configs/</w:t>
-      </w:r>
-      <w:r>
-        <w:rPr>
-          <w:rFonts w:ascii="Consolas" w:hAnsi="Consolas"/>
-        </w:rPr>
-        <w:br/>
-        <w:t>├── tests/</w:t>
-      </w:r>
-      <w:r>
-        <w:rPr>
-          <w:rFonts w:ascii="Consolas" w:hAnsi="Consolas"/>
-        </w:rPr>
-        <w:br/>
-        <w:t>├── notebooks/</w:t>
-      </w:r>
-      <w:r>
-        <w:rPr>
-          <w:rFonts w:ascii="Consolas" w:hAnsi="Consolas"/>
-        </w:rPr>
-        <w:br/>
-        <w:t>├── requirements.txt</w:t>
-      </w:r>
-      <w:r>
-        <w:rPr>
-          <w:rFonts w:ascii="Consolas" w:hAnsi="Consolas"/>
-        </w:rPr>
-        <w:br/>
-        <w:t>└── README.md</w:t>
-      </w:r>
     </w:p>
     <w:p>
       <w:pPr>
         <w:pStyle w:val="Heading1"/>
       </w:pPr>
       <w:r>
-        <w:t>20. Functional Modules</w:t>
+        <w:t>19</w:t>
+      </w:r>
+      <w:r>
+        <w:t>. Functional Modules</w:t>
       </w:r>
     </w:p>
     <w:tbl>
@@ -4239,6 +4151,7 @@
           </w:tcPr>
           <w:p>
             <w:r>
+              <w:lastRenderedPageBreak/>
               <w:t>Flow Feature Module</w:t>
             </w:r>
           </w:p>
@@ -4469,7 +4382,13 @@
           </w:tcPr>
           <w:p>
             <w:r>
-              <w:t>Calculates SIH-aligned and additional forecasting metrics.</w:t>
+              <w:t xml:space="preserve">Calculates </w:t>
+            </w:r>
+            <w:r>
+              <w:t>compulsory</w:t>
+            </w:r>
+            <w:r>
+              <w:t xml:space="preserve"> and additional forecasting metrics.</w:t>
             </w:r>
           </w:p>
         </w:tc>
@@ -4480,7 +4399,13 @@
         <w:pStyle w:val="Heading1"/>
       </w:pPr>
       <w:r>
-        <w:t>21. Security and Privacy Considerations</w:t>
+        <w:t>2</w:t>
+      </w:r>
+      <w:r>
+        <w:t>0</w:t>
+      </w:r>
+      <w:r>
+        <w:t>. Security and Privacy Considerations</w:t>
       </w:r>
     </w:p>
     <w:p>
@@ -4551,7 +4476,13 @@
         <w:pStyle w:val="Heading1"/>
       </w:pPr>
       <w:r>
-        <w:t>22. Reproducibility and Experiment Management</w:t>
+        <w:t>2</w:t>
+      </w:r>
+      <w:r>
+        <w:t>1</w:t>
+      </w:r>
+      <w:r>
+        <w:t>. Reproducibility and Experiment Management</w:t>
       </w:r>
     </w:p>
     <w:p>
@@ -4623,8 +4554,219 @@
         <w:spacing w:after="40"/>
       </w:pPr>
       <w:r>
+        <w:t>Keep a separate untouched test set.</w:t>
+      </w:r>
+    </w:p>
+    <w:p>
+      <w:pPr>
+        <w:pStyle w:val="Heading1"/>
+      </w:pPr>
+      <w:r>
+        <w:t>2</w:t>
+      </w:r>
+      <w:r>
+        <w:t>2</w:t>
+      </w:r>
+      <w:r>
+        <w:t>. Demonstration Scenario</w:t>
+      </w:r>
+    </w:p>
+    <w:p>
+      <w:pPr>
+        <w:pStyle w:val="Heading2"/>
+        <w:numPr>
+          <w:ilvl w:val="1"/>
+          <w:numId w:val="14"/>
+        </w:numPr>
+      </w:pPr>
+      <w:r>
+        <w:t>Demonstration Flow</w:t>
+      </w:r>
+    </w:p>
+    <w:p>
+      <w:pPr>
+        <w:pStyle w:val="ListNumber"/>
+        <w:numPr>
+          <w:ilvl w:val="0"/>
+          <w:numId w:val="0"/>
+        </w:numPr>
+        <w:spacing w:after="40"/>
+      </w:pPr>
+      <w:r>
+        <w:t>1.</w:t>
+      </w:r>
+      <w:r>
+        <w:t>Load a representative PCAP containing chronological benign and attack activity.</w:t>
+      </w:r>
+    </w:p>
+    <w:p>
+      <w:pPr>
+        <w:pStyle w:val="ListNumber"/>
+        <w:numPr>
+          <w:ilvl w:val="0"/>
+          <w:numId w:val="0"/>
+        </w:numPr>
+        <w:spacing w:after="40"/>
+        <w:ind w:left="360" w:hanging="360"/>
+      </w:pPr>
+      <w:r>
+        <w:t>2.</w:t>
+      </w:r>
+      <w:r>
+        <w:t>Show the current traffic state on the dashboard.</w:t>
+      </w:r>
+    </w:p>
+    <w:p>
+      <w:pPr>
+        <w:pStyle w:val="ListNumber"/>
+        <w:numPr>
+          <w:ilvl w:val="0"/>
+          <w:numId w:val="0"/>
+        </w:numPr>
+        <w:spacing w:after="40"/>
+        <w:ind w:left="360" w:hanging="360"/>
+      </w:pPr>
+      <w:r>
+        <w:t>3.</w:t>
+      </w:r>
+      <w:r>
+        <w:t>Display recent network-state history.</w:t>
+      </w:r>
+    </w:p>
+    <w:p>
+      <w:pPr>
+        <w:pStyle w:val="ListNumber"/>
+        <w:numPr>
+          <w:ilvl w:val="0"/>
+          <w:numId w:val="0"/>
+        </w:numPr>
+        <w:spacing w:after="40"/>
+        <w:ind w:left="360" w:hanging="360"/>
+      </w:pPr>
+      <w:r>
+        <w:t>4.</w:t>
+      </w:r>
+      <w:r>
+        <w:t>Run the world model from the latest state.</w:t>
+      </w:r>
+    </w:p>
+    <w:p>
+      <w:pPr>
+        <w:pStyle w:val="ListNumber"/>
+        <w:numPr>
+          <w:ilvl w:val="0"/>
+          <w:numId w:val="0"/>
+        </w:numPr>
+        <w:spacing w:after="40"/>
+        <w:ind w:left="360" w:hanging="360"/>
+      </w:pPr>
+      <w:r>
+        <w:t>5.</w:t>
+      </w:r>
+      <w:r>
+        <w:t>Show K-step future-state rollout.</w:t>
+      </w:r>
+    </w:p>
+    <w:p>
+      <w:pPr>
+        <w:pStyle w:val="ListNumber"/>
+        <w:numPr>
+          <w:ilvl w:val="0"/>
+          <w:numId w:val="0"/>
+        </w:numPr>
+        <w:spacing w:after="40"/>
+        <w:ind w:left="360" w:hanging="360"/>
+      </w:pPr>
+      <w:r>
+        <w:t>6.</w:t>
+      </w:r>
+      <w:r>
+        <w:t>Display the forecasted infiltration likelihood timeline.</w:t>
+      </w:r>
+    </w:p>
+    <w:p>
+      <w:pPr>
+        <w:pStyle w:val="ListNumber"/>
+        <w:numPr>
+          <w:ilvl w:val="0"/>
+          <w:numId w:val="0"/>
+        </w:numPr>
+        <w:spacing w:after="40"/>
+        <w:ind w:left="360" w:hanging="360"/>
+      </w:pPr>
+      <w:r>
         <w:lastRenderedPageBreak/>
-        <w:t>Keep a separate untouched test set.</w:t>
+        <w:t>7.</w:t>
+      </w:r>
+      <w:r>
+        <w:t>Show the predicted future attack stage.</w:t>
+      </w:r>
+    </w:p>
+    <w:p>
+      <w:pPr>
+        <w:pStyle w:val="ListNumber"/>
+        <w:numPr>
+          <w:ilvl w:val="0"/>
+          <w:numId w:val="0"/>
+        </w:numPr>
+        <w:spacing w:after="40"/>
+        <w:ind w:left="360" w:hanging="360"/>
+      </w:pPr>
+      <w:r>
+        <w:t>8.</w:t>
+      </w:r>
+      <w:r>
+        <w:t>Highlight the features and flows contributing to the forecast.</w:t>
+      </w:r>
+    </w:p>
+    <w:p>
+      <w:pPr>
+        <w:pStyle w:val="ListNumber"/>
+        <w:numPr>
+          <w:ilvl w:val="0"/>
+          <w:numId w:val="0"/>
+        </w:numPr>
+        <w:spacing w:after="40"/>
+        <w:ind w:left="360" w:hanging="360"/>
+      </w:pPr>
+      <w:r>
+        <w:t>9.</w:t>
+      </w:r>
+      <w:r>
+        <w:t>Compare the temporal model with the logistic baseline.</w:t>
+      </w:r>
+    </w:p>
+    <w:p>
+      <w:pPr>
+        <w:pStyle w:val="ListNumber"/>
+        <w:numPr>
+          <w:ilvl w:val="0"/>
+          <w:numId w:val="0"/>
+        </w:numPr>
+        <w:spacing w:after="40"/>
+        <w:ind w:left="360" w:hanging="360"/>
+      </w:pPr>
+      <w:r>
+        <w:t>10.</w:t>
+      </w:r>
+      <w:r>
+        <w:t>Show that the same inference process works with Internet connectivity disabled.</w:t>
+      </w:r>
+    </w:p>
+    <w:p>
+      <w:pPr>
+        <w:pStyle w:val="Heading2"/>
+      </w:pPr>
+      <w:r>
+        <w:t>23.2 Explanation</w:t>
+      </w:r>
+    </w:p>
+    <w:p>
+      <w:pPr>
+        <w:spacing w:after="100"/>
+      </w:pPr>
+      <w:r>
+        <w:t>The system does not wait until an attack is obvious. It observes how the network is evolving, learns the transition pattern between network states, simulates plausible future states, and provides an early forecast together with evidence explaining why the forecast changed.</w:t>
       </w:r>
     </w:p>
     <w:p>
@@ -4632,129 +4774,13 @@
         <w:pStyle w:val="Heading1"/>
       </w:pPr>
       <w:r>
-        <w:t>23. Demonstration Scenario</w:t>
-      </w:r>
-    </w:p>
-    <w:p>
-      <w:pPr>
-        <w:pStyle w:val="Heading2"/>
-      </w:pPr>
-      <w:r>
-        <w:t>23.1 Demonstration Flow</w:t>
-      </w:r>
-    </w:p>
-    <w:p>
-      <w:pPr>
-        <w:pStyle w:val="ListNumber"/>
-        <w:spacing w:after="40"/>
-      </w:pPr>
-      <w:r>
-        <w:t>Load a representative PCAP containing chronological benign and attack activity.</w:t>
-      </w:r>
-    </w:p>
-    <w:p>
-      <w:pPr>
-        <w:pStyle w:val="ListNumber"/>
-        <w:spacing w:after="40"/>
-      </w:pPr>
-      <w:r>
-        <w:t>Show the current traffic state on the dashboard.</w:t>
-      </w:r>
-    </w:p>
-    <w:p>
-      <w:pPr>
-        <w:pStyle w:val="ListNumber"/>
-        <w:spacing w:after="40"/>
-      </w:pPr>
-      <w:r>
-        <w:t>Display recent network-state history.</w:t>
-      </w:r>
-    </w:p>
-    <w:p>
-      <w:pPr>
-        <w:pStyle w:val="ListNumber"/>
-        <w:spacing w:after="40"/>
-      </w:pPr>
-      <w:r>
-        <w:t>Run the world model from the latest state.</w:t>
-      </w:r>
-    </w:p>
-    <w:p>
-      <w:pPr>
-        <w:pStyle w:val="ListNumber"/>
-        <w:spacing w:after="40"/>
-      </w:pPr>
-      <w:r>
-        <w:t>Show K-step future-state rollout.</w:t>
-      </w:r>
-    </w:p>
-    <w:p>
-      <w:pPr>
-        <w:pStyle w:val="ListNumber"/>
-        <w:spacing w:after="40"/>
-      </w:pPr>
-      <w:r>
-        <w:t>Display the forecasted infiltration likelihood timeline.</w:t>
-      </w:r>
-    </w:p>
-    <w:p>
-      <w:pPr>
-        <w:pStyle w:val="ListNumber"/>
-        <w:spacing w:after="40"/>
-      </w:pPr>
-      <w:r>
-        <w:t>Show the predicted future attack stage.</w:t>
-      </w:r>
-    </w:p>
-    <w:p>
-      <w:pPr>
-        <w:pStyle w:val="ListNumber"/>
-        <w:spacing w:after="40"/>
-      </w:pPr>
-      <w:r>
-        <w:t>Highlight the features and flows contributing to the forecast.</w:t>
-      </w:r>
-    </w:p>
-    <w:p>
-      <w:pPr>
-        <w:pStyle w:val="ListNumber"/>
-        <w:spacing w:after="40"/>
-      </w:pPr>
-      <w:r>
-        <w:t>Compare the temporal model with the logistic baseline.</w:t>
-      </w:r>
-    </w:p>
-    <w:p>
-      <w:pPr>
-        <w:pStyle w:val="ListNumber"/>
-        <w:spacing w:after="40"/>
-      </w:pPr>
-      <w:r>
-        <w:t>Show that the same inference process works with Internet connectivity disabled.</w:t>
-      </w:r>
-    </w:p>
-    <w:p>
-      <w:pPr>
-        <w:pStyle w:val="Heading2"/>
-      </w:pPr>
-      <w:r>
-        <w:t>23.2 Judge-Facing Explanation</w:t>
-      </w:r>
-    </w:p>
-    <w:p>
-      <w:pPr>
-        <w:spacing w:after="100"/>
-      </w:pPr>
-      <w:r>
-        <w:t>The simplest explanation to a judge is: the system does not wait until an attack is obvious. It observes how the network is evolving, learns the transition pattern between network states, simulates plausible future states, and provides an early forecast together with evidence explaining why the forecast changed.</w:t>
-      </w:r>
-    </w:p>
-    <w:p>
-      <w:pPr>
-        <w:pStyle w:val="Heading1"/>
-      </w:pPr>
-      <w:r>
-        <w:t>24. Expected Outcomes</w:t>
+        <w:t>2</w:t>
+      </w:r>
+      <w:r>
+        <w:t>3</w:t>
+      </w:r>
+      <w:r>
+        <w:t>. Expected Outcomes</w:t>
       </w:r>
     </w:p>
     <w:p>
@@ -4843,7 +4869,13 @@
         <w:pStyle w:val="Heading1"/>
       </w:pPr>
       <w:r>
-        <w:t>25. Risks and Mitigation</w:t>
+        <w:t>2</w:t>
+      </w:r>
+      <w:r>
+        <w:t>4</w:t>
+      </w:r>
+      <w:r>
+        <w:t>. Risks and Mitigation</w:t>
       </w:r>
     </w:p>
     <w:tbl>
@@ -5053,11 +5085,7 @@
           </w:tcPr>
           <w:p>
             <w:r>
-              <w:t xml:space="preserve">Tune thresholds and report </w:t>
-            </w:r>
-            <w:r>
-              <w:lastRenderedPageBreak/>
-              <w:t>FPR</w:t>
+              <w:t>Tune thresholds and report FPR</w:t>
             </w:r>
           </w:p>
         </w:tc>
@@ -5069,7 +5097,6 @@
           </w:tcPr>
           <w:p>
             <w:r>
-              <w:lastRenderedPageBreak/>
               <w:t>Over-complex model</w:t>
             </w:r>
           </w:p>
@@ -5165,7 +5192,74 @@
         <w:pStyle w:val="Heading1"/>
       </w:pPr>
       <w:r>
-        <w:t>26. Development Roadmap</w:t>
+        <w:t>2</w:t>
+      </w:r>
+      <w:r>
+        <w:t>5</w:t>
+      </w:r>
+      <w:r>
+        <w:t xml:space="preserve">. Final Architecture </w:t>
+      </w:r>
+    </w:p>
+    <w:p>
+      <w:pPr>
+        <w:spacing w:after="100"/>
+      </w:pPr>
+      <w:r>
+        <w:t xml:space="preserve">The recommended final system is an offline, AI-based predictive cybersecurity platform. It ingests PCAP and flow traffic, extracts packet and flow characteristics, constructs chronological network states, learns temporal transition dynamics through a world model, performs K-step forward </w:t>
+      </w:r>
+      <w:r>
+        <w:lastRenderedPageBreak/>
+        <w:t>simulation, forecasts network-level infiltration likelihood, interprets the predicted behavior in attack-stage terms, and explains the forecast using contributing features and flows.</w:t>
+      </w:r>
+    </w:p>
+    <w:p>
+      <w:pPr>
+        <w:spacing w:after="100"/>
+      </w:pPr>
+      <w:r>
+        <w:t>The central design principle is that the system should forecast the evolution of the network rather than simply classify an individual packet or flow. Node- and flow-level information is used to construct the network state and provide supporting evidence; the primary requested forecast remains the network/trajectory-level infiltration likelihood over future windows.</w:t>
+      </w:r>
+    </w:p>
+    <w:p>
+      <w:pPr>
+        <w:pStyle w:val="Heading1"/>
+      </w:pPr>
+      <w:r>
+        <w:t>26</w:t>
+      </w:r>
+      <w:r>
+        <w:t>. Conclusion</w:t>
+      </w:r>
+    </w:p>
+    <w:p>
+      <w:pPr>
+        <w:spacing w:after="100"/>
+      </w:pPr>
+      <w:r>
+        <w:t>This problem</w:t>
+      </w:r>
+      <w:r>
+        <w:t xml:space="preserve"> presents a challenging shift from reactive intrusion detection toward predictive cyber defense. The proposed architecture addresses this by treating network traffic as a time-evolving system. A world model learns how network states change, forward simulation generates possible future states, and an infiltration prediction head converts those future states into a forecast timeline. Explainability connects the forecast back to observable network behavior.</w:t>
+      </w:r>
+    </w:p>
+    <w:p>
+      <w:pPr>
+        <w:spacing w:after="100"/>
+      </w:pPr>
+      <w:r>
+        <w:t>The recommended implementation strategy is deliberately incremental: establish a reliable flow/packet feature pipeline, create a logistic baseline, implement an LSTM/GRU world model, validate K-step forecasting, add explainability, and then consider Transformer or graph-based extensions. The entire inference stack can be packaged locally so that the demonstration remains functional with the Internet disconnected.</w:t>
+      </w:r>
+    </w:p>
+    <w:p>
+      <w:pPr>
+        <w:pStyle w:val="Heading1"/>
+      </w:pPr>
+      <w:r>
+        <w:t>27</w:t>
+      </w:r>
+      <w:r>
+        <w:t>. Key Terms</w:t>
       </w:r>
     </w:p>
     <w:tbl>
@@ -5188,7 +5282,7 @@
               <w:rPr>
                 <w:b/>
               </w:rPr>
-              <w:t>Phase</w:t>
+              <w:t>Term</w:t>
             </w:r>
           </w:p>
         </w:tc>
@@ -5201,7 +5295,7 @@
               <w:rPr>
                 <w:b/>
               </w:rPr>
-              <w:t>Main Work</w:t>
+              <w:t xml:space="preserve">Meaning </w:t>
             </w:r>
           </w:p>
         </w:tc>
@@ -5213,7 +5307,7 @@
           </w:tcPr>
           <w:p>
             <w:r>
-              <w:t>Phase 1</w:t>
+              <w:t>Network State</w:t>
             </w:r>
           </w:p>
         </w:tc>
@@ -5223,7 +5317,7 @@
           </w:tcPr>
           <w:p>
             <w:r>
-              <w:t>PS analysis, dataset acquisition, repository setup, common schema</w:t>
+              <w:t>Representation of network behavior during a time window</w:t>
             </w:r>
           </w:p>
         </w:tc>
@@ -5235,7 +5329,7 @@
           </w:tcPr>
           <w:p>
             <w:r>
-              <w:t>Phase 2</w:t>
+              <w:t>World Model</w:t>
             </w:r>
           </w:p>
         </w:tc>
@@ -5245,7 +5339,7 @@
           </w:tcPr>
           <w:p>
             <w:r>
-              <w:t>PCAP and flow ingestion + feature extraction</w:t>
+              <w:t>Learned model of network-state transition dynamics</w:t>
             </w:r>
           </w:p>
         </w:tc>
@@ -5257,7 +5351,7 @@
           </w:tcPr>
           <w:p>
             <w:r>
-              <w:t>Phase 3</w:t>
+              <w:t>State Transition</w:t>
             </w:r>
           </w:p>
         </w:tc>
@@ -5267,7 +5361,15 @@
           </w:tcPr>
           <w:p>
             <w:r>
-              <w:t>Time-window and network-state construction</w:t>
+              <w:t xml:space="preserve">Change from </w:t>
+            </w:r>
+            <w:proofErr w:type="spellStart"/>
+            <w:r>
+              <w:t>S_t</w:t>
+            </w:r>
+            <w:proofErr w:type="spellEnd"/>
+            <w:r>
+              <w:t xml:space="preserve"> to S_(t+1)</w:t>
             </w:r>
           </w:p>
         </w:tc>
@@ -5279,7 +5381,7 @@
           </w:tcPr>
           <w:p>
             <w:r>
-              <w:t>Phase 4</w:t>
+              <w:t>Forward Rollout</w:t>
             </w:r>
           </w:p>
         </w:tc>
@@ -5289,7 +5391,7 @@
           </w:tcPr>
           <w:p>
             <w:r>
-              <w:t>Logistic-regression baseline</w:t>
+              <w:t>Recursive prediction of future states</w:t>
             </w:r>
           </w:p>
         </w:tc>
@@ -5301,7 +5403,7 @@
           </w:tcPr>
           <w:p>
             <w:r>
-              <w:t>Phase 5</w:t>
+              <w:t>K-Step Forecast</w:t>
             </w:r>
           </w:p>
         </w:tc>
@@ -5311,7 +5413,7 @@
           </w:tcPr>
           <w:p>
             <w:r>
-              <w:t>LSTM/GRU world model and next-state prediction</w:t>
+              <w:t>Prediction over K future windows</w:t>
             </w:r>
           </w:p>
         </w:tc>
@@ -5323,7 +5425,7 @@
           </w:tcPr>
           <w:p>
             <w:r>
-              <w:t>Phase 6</w:t>
+              <w:t>Infiltration Likelihood</w:t>
             </w:r>
           </w:p>
         </w:tc>
@@ -5333,7 +5435,7 @@
           </w:tcPr>
           <w:p>
             <w:r>
-              <w:t>K-step rollout and infiltration forecast</w:t>
+              <w:t>Forecasted likelihood of infiltration in a future window</w:t>
             </w:r>
           </w:p>
         </w:tc>
@@ -5345,529 +5447,6 @@
           </w:tcPr>
           <w:p>
             <w:r>
-              <w:t>Phase 7</w:t>
-            </w:r>
-          </w:p>
-        </w:tc>
-        <w:tc>
-          <w:tcPr>
-            <w:tcW w:w="4968" w:type="dxa"/>
-          </w:tcPr>
-          <w:p>
-            <w:r>
-              <w:t>Attack-stage mapping and explainability</w:t>
-            </w:r>
-          </w:p>
-        </w:tc>
-      </w:tr>
-      <w:tr>
-        <w:tc>
-          <w:tcPr>
-            <w:tcW w:w="4968" w:type="dxa"/>
-          </w:tcPr>
-          <w:p>
-            <w:r>
-              <w:t>Phase 8</w:t>
-            </w:r>
-          </w:p>
-        </w:tc>
-        <w:tc>
-          <w:tcPr>
-            <w:tcW w:w="4968" w:type="dxa"/>
-          </w:tcPr>
-          <w:p>
-            <w:r>
-              <w:t>Dashboard and offline packaging</w:t>
-            </w:r>
-          </w:p>
-        </w:tc>
-      </w:tr>
-      <w:tr>
-        <w:tc>
-          <w:tcPr>
-            <w:tcW w:w="4968" w:type="dxa"/>
-          </w:tcPr>
-          <w:p>
-            <w:r>
-              <w:t>Phase 9</w:t>
-            </w:r>
-          </w:p>
-        </w:tc>
-        <w:tc>
-          <w:tcPr>
-            <w:tcW w:w="4968" w:type="dxa"/>
-          </w:tcPr>
-          <w:p>
-            <w:r>
-              <w:t>Cross-dataset validation and ablation studies</w:t>
-            </w:r>
-          </w:p>
-        </w:tc>
-      </w:tr>
-      <w:tr>
-        <w:tc>
-          <w:tcPr>
-            <w:tcW w:w="4968" w:type="dxa"/>
-          </w:tcPr>
-          <w:p>
-            <w:r>
-              <w:t>Phase 10</w:t>
-            </w:r>
-          </w:p>
-        </w:tc>
-        <w:tc>
-          <w:tcPr>
-            <w:tcW w:w="4968" w:type="dxa"/>
-          </w:tcPr>
-          <w:p>
-            <w:r>
-              <w:t>Final SIH demonstration, documentation, testing and optimization</w:t>
-            </w:r>
-          </w:p>
-        </w:tc>
-      </w:tr>
-    </w:tbl>
-    <w:p>
-      <w:pPr>
-        <w:pStyle w:val="Heading1"/>
-      </w:pPr>
-      <w:r>
-        <w:t>27. Recommended Final MVP</w:t>
-      </w:r>
-    </w:p>
-    <w:p>
-      <w:pPr>
-        <w:spacing w:after="100"/>
-      </w:pPr>
-      <w:r>
-        <w:t>The minimum complete solution should not attempt to implement every possible research extension. The recommended MVP consists of:</w:t>
-      </w:r>
-    </w:p>
-    <w:p>
-      <w:pPr>
-        <w:pStyle w:val="ListNumber"/>
-        <w:spacing w:after="40"/>
-      </w:pPr>
-      <w:r>
-        <w:t>CIC-IDS2018-based training pipeline.</w:t>
-      </w:r>
-    </w:p>
-    <w:p>
-      <w:pPr>
-        <w:pStyle w:val="ListNumber"/>
-        <w:spacing w:after="40"/>
-      </w:pPr>
-      <w:r>
-        <w:t>PCAP + flow feature ingestion.</w:t>
-      </w:r>
-    </w:p>
-    <w:p>
-      <w:pPr>
-        <w:pStyle w:val="ListNumber"/>
-        <w:spacing w:after="40"/>
-      </w:pPr>
-      <w:r>
-        <w:t>Chronological time-window construction.</w:t>
-      </w:r>
-    </w:p>
-    <w:p>
-      <w:pPr>
-        <w:pStyle w:val="ListNumber"/>
-        <w:spacing w:after="40"/>
-      </w:pPr>
-      <w:r>
-        <w:t>Structured network-state representation.</w:t>
-      </w:r>
-    </w:p>
-    <w:p>
-      <w:pPr>
-        <w:pStyle w:val="ListNumber"/>
-        <w:spacing w:after="40"/>
-      </w:pPr>
-      <w:r>
-        <w:t>Logistic-regression baseline.</w:t>
-      </w:r>
-    </w:p>
-    <w:p>
-      <w:pPr>
-        <w:pStyle w:val="ListNumber"/>
-        <w:spacing w:after="40"/>
-      </w:pPr>
-      <w:r>
-        <w:t>LSTM-based world model.</w:t>
-      </w:r>
-    </w:p>
-    <w:p>
-      <w:pPr>
-        <w:pStyle w:val="ListNumber"/>
-        <w:spacing w:after="40"/>
-      </w:pPr>
-      <w:r>
-        <w:t>Next-state prediction.</w:t>
-      </w:r>
-    </w:p>
-    <w:p>
-      <w:pPr>
-        <w:pStyle w:val="ListNumber"/>
-        <w:spacing w:after="40"/>
-      </w:pPr>
-      <w:r>
-        <w:t>K-step forward rollout.</w:t>
-      </w:r>
-    </w:p>
-    <w:p>
-      <w:pPr>
-        <w:pStyle w:val="ListNumber"/>
-        <w:spacing w:after="40"/>
-      </w:pPr>
-      <w:r>
-        <w:t>Network-level infiltration likelihood timeline.</w:t>
-      </w:r>
-    </w:p>
-    <w:p>
-      <w:pPr>
-        <w:pStyle w:val="ListNumber"/>
-        <w:spacing w:after="40"/>
-      </w:pPr>
-      <w:r>
-        <w:t>Attack-stage interpretation.</w:t>
-      </w:r>
-    </w:p>
-    <w:p>
-      <w:pPr>
-        <w:pStyle w:val="ListNumber"/>
-        <w:spacing w:after="40"/>
-      </w:pPr>
-      <w:r>
-        <w:t>Feature/flow explanation.</w:t>
-      </w:r>
-    </w:p>
-    <w:p>
-      <w:pPr>
-        <w:pStyle w:val="ListNumber"/>
-        <w:spacing w:after="40"/>
-      </w:pPr>
-      <w:r>
-        <w:t>Local offline dashboard.</w:t>
-      </w:r>
-    </w:p>
-    <w:p>
-      <w:pPr>
-        <w:pStyle w:val="ListNumber"/>
-        <w:spacing w:after="40"/>
-      </w:pPr>
-      <w:r>
-        <w:t>Validation on at least one independent dataset such as UNSW-NB15.</w:t>
-      </w:r>
-    </w:p>
-    <w:p>
-      <w:pPr>
-        <w:pStyle w:val="Heading1"/>
-      </w:pPr>
-      <w:r>
-        <w:t>28. Advanced Version</w:t>
-      </w:r>
-    </w:p>
-    <w:p>
-      <w:pPr>
-        <w:spacing w:after="100"/>
-      </w:pPr>
-      <w:r>
-        <w:t xml:space="preserve">After the MVP is stable, the team can investigate a Temporal Transformer and/or GNN + temporal architecture. The advanced version should be justified experimentally. Complexity should only be </w:t>
-      </w:r>
-      <w:r>
-        <w:lastRenderedPageBreak/>
-        <w:t>added when it improves forecasting quality, generalization, interpretability, or the ability to represent network relationships.</w:t>
-      </w:r>
-    </w:p>
-    <w:p>
-      <w:pPr>
-        <w:pStyle w:val="ListBullet"/>
-        <w:spacing w:after="40"/>
-      </w:pPr>
-      <w:r>
-        <w:t>Temporal Transformer world model.</w:t>
-      </w:r>
-    </w:p>
-    <w:p>
-      <w:pPr>
-        <w:pStyle w:val="ListBullet"/>
-        <w:spacing w:after="40"/>
-      </w:pPr>
-      <w:r>
-        <w:t>Graph representation of communicating hosts.</w:t>
-      </w:r>
-    </w:p>
-    <w:p>
-      <w:pPr>
-        <w:pStyle w:val="ListBullet"/>
-        <w:spacing w:after="40"/>
-      </w:pPr>
-      <w:r>
-        <w:t>GNN encoder + temporal dynamics.</w:t>
-      </w:r>
-    </w:p>
-    <w:p>
-      <w:pPr>
-        <w:pStyle w:val="ListBullet"/>
-        <w:spacing w:after="40"/>
-      </w:pPr>
-      <w:r>
-        <w:t>Improved probability calibration.</w:t>
-      </w:r>
-    </w:p>
-    <w:p>
-      <w:pPr>
-        <w:pStyle w:val="ListBullet"/>
-        <w:spacing w:after="40"/>
-      </w:pPr>
-      <w:r>
-        <w:t>Cross-dataset domain adaptation.</w:t>
-      </w:r>
-    </w:p>
-    <w:p>
-      <w:pPr>
-        <w:pStyle w:val="ListBullet"/>
-        <w:spacing w:after="40"/>
-      </w:pPr>
-      <w:r>
-        <w:t>Richer flow-level evidence tracing.</w:t>
-      </w:r>
-    </w:p>
-    <w:p>
-      <w:pPr>
-        <w:pStyle w:val="Heading1"/>
-      </w:pPr>
-      <w:r>
-        <w:t>29. Final Architecture Summary</w:t>
-      </w:r>
-    </w:p>
-    <w:p>
-      <w:pPr>
-        <w:spacing w:after="100"/>
-      </w:pPr>
-      <w:r>
-        <w:t>The recommended final system is an offline, AI-based predictive cybersecurity platform. It ingests PCAP and flow traffic, extracts packet and flow characteristics, constructs chronological network states, learns temporal transition dynamics through a world model, performs K-step forward simulation, forecasts network-level infiltration likelihood, interprets the predicted behavior in attack-stage terms, and explains the forecast using contributing features and flows.</w:t>
-      </w:r>
-    </w:p>
-    <w:p>
-      <w:pPr>
-        <w:spacing w:after="100"/>
-      </w:pPr>
-      <w:r>
-        <w:t>The central design principle is that the system should forecast the evolution of the network rather than simply classify an individual packet or flow. Node- and flow-level information is used to construct the network state and provide supporting evidence; the primary requested forecast remains the network/trajectory-level infiltration likelihood over future windows.</w:t>
-      </w:r>
-    </w:p>
-    <w:p>
-      <w:pPr>
-        <w:pStyle w:val="Heading1"/>
-      </w:pPr>
-      <w:r>
-        <w:t>30. Conclusion</w:t>
-      </w:r>
-    </w:p>
-    <w:p>
-      <w:pPr>
-        <w:spacing w:after="100"/>
-      </w:pPr>
-      <w:r>
-        <w:t>SIH26153 presents a challenging shift from reactive intrusion detection toward predictive cyber defense. The proposed architecture addresses this by treating network traffic as a time-evolving system. A world model learns how network states change, forward simulation generates possible future states, and an infiltration prediction head converts those future states into a forecast timeline. Explainability connects the forecast back to observable network behavior.</w:t>
-      </w:r>
-    </w:p>
-    <w:p>
-      <w:pPr>
-        <w:spacing w:after="100"/>
-      </w:pPr>
-      <w:r>
-        <w:t>The recommended implementation strategy is deliberately incremental: establish a reliable flow/packet feature pipeline, create a logistic baseline, implement an LSTM/GRU world model, validate K-step forecasting, add explainability, and then consider Transformer or graph-based extensions. The entire inference stack can be packaged locally so that the SIH demonstration remains functional with the Internet disconnected.</w:t>
-      </w:r>
-    </w:p>
-    <w:p>
-      <w:pPr>
-        <w:pStyle w:val="Heading1"/>
-      </w:pPr>
-      <w:r>
-        <w:t>31. Key Terms</w:t>
-      </w:r>
-    </w:p>
-    <w:tbl>
-      <w:tblPr>
-        <w:tblStyle w:val="TableGrid"/>
-        <w:tblW w:w="0" w:type="auto"/>
-        <w:tblLook w:val="04A0" w:firstRow="1" w:lastRow="0" w:firstColumn="1" w:lastColumn="0" w:noHBand="0" w:noVBand="1"/>
-      </w:tblPr>
-      <w:tblGrid>
-        <w:gridCol w:w="4968"/>
-        <w:gridCol w:w="4968"/>
-      </w:tblGrid>
-      <w:tr>
-        <w:tc>
-          <w:tcPr>
-            <w:tcW w:w="4968" w:type="dxa"/>
-          </w:tcPr>
-          <w:p>
-            <w:r>
-              <w:rPr>
-                <w:b/>
-              </w:rPr>
-              <w:t>Term</w:t>
-            </w:r>
-          </w:p>
-        </w:tc>
-        <w:tc>
-          <w:tcPr>
-            <w:tcW w:w="4968" w:type="dxa"/>
-          </w:tcPr>
-          <w:p>
-            <w:r>
-              <w:rPr>
-                <w:b/>
-              </w:rPr>
-              <w:t>Meaning in This Project</w:t>
-            </w:r>
-          </w:p>
-        </w:tc>
-      </w:tr>
-      <w:tr>
-        <w:tc>
-          <w:tcPr>
-            <w:tcW w:w="4968" w:type="dxa"/>
-          </w:tcPr>
-          <w:p>
-            <w:r>
-              <w:t>Network State</w:t>
-            </w:r>
-          </w:p>
-        </w:tc>
-        <w:tc>
-          <w:tcPr>
-            <w:tcW w:w="4968" w:type="dxa"/>
-          </w:tcPr>
-          <w:p>
-            <w:r>
-              <w:t>Representation of network behavior during a time window</w:t>
-            </w:r>
-          </w:p>
-        </w:tc>
-      </w:tr>
-      <w:tr>
-        <w:tc>
-          <w:tcPr>
-            <w:tcW w:w="4968" w:type="dxa"/>
-          </w:tcPr>
-          <w:p>
-            <w:r>
-              <w:t>World Model</w:t>
-            </w:r>
-          </w:p>
-        </w:tc>
-        <w:tc>
-          <w:tcPr>
-            <w:tcW w:w="4968" w:type="dxa"/>
-          </w:tcPr>
-          <w:p>
-            <w:r>
-              <w:t>Learned model of network-state transition dynamics</w:t>
-            </w:r>
-          </w:p>
-        </w:tc>
-      </w:tr>
-      <w:tr>
-        <w:tc>
-          <w:tcPr>
-            <w:tcW w:w="4968" w:type="dxa"/>
-          </w:tcPr>
-          <w:p>
-            <w:r>
-              <w:t>State Transition</w:t>
-            </w:r>
-          </w:p>
-        </w:tc>
-        <w:tc>
-          <w:tcPr>
-            <w:tcW w:w="4968" w:type="dxa"/>
-          </w:tcPr>
-          <w:p>
-            <w:r>
-              <w:t>Change from S_t to S_(t+1)</w:t>
-            </w:r>
-          </w:p>
-        </w:tc>
-      </w:tr>
-      <w:tr>
-        <w:tc>
-          <w:tcPr>
-            <w:tcW w:w="4968" w:type="dxa"/>
-          </w:tcPr>
-          <w:p>
-            <w:r>
-              <w:t>Forward Rollout</w:t>
-            </w:r>
-          </w:p>
-        </w:tc>
-        <w:tc>
-          <w:tcPr>
-            <w:tcW w:w="4968" w:type="dxa"/>
-          </w:tcPr>
-          <w:p>
-            <w:r>
-              <w:t>Recursive prediction of future states</w:t>
-            </w:r>
-          </w:p>
-        </w:tc>
-      </w:tr>
-      <w:tr>
-        <w:tc>
-          <w:tcPr>
-            <w:tcW w:w="4968" w:type="dxa"/>
-          </w:tcPr>
-          <w:p>
-            <w:r>
-              <w:t>K-Step Forecast</w:t>
-            </w:r>
-          </w:p>
-        </w:tc>
-        <w:tc>
-          <w:tcPr>
-            <w:tcW w:w="4968" w:type="dxa"/>
-          </w:tcPr>
-          <w:p>
-            <w:r>
-              <w:t>Prediction over K future windows</w:t>
-            </w:r>
-          </w:p>
-        </w:tc>
-      </w:tr>
-      <w:tr>
-        <w:tc>
-          <w:tcPr>
-            <w:tcW w:w="4968" w:type="dxa"/>
-          </w:tcPr>
-          <w:p>
-            <w:r>
-              <w:t>Infiltration Likelihood</w:t>
-            </w:r>
-          </w:p>
-        </w:tc>
-        <w:tc>
-          <w:tcPr>
-            <w:tcW w:w="4968" w:type="dxa"/>
-          </w:tcPr>
-          <w:p>
-            <w:r>
-              <w:t>Forecasted likelihood of infiltration in a future window</w:t>
-            </w:r>
-          </w:p>
-        </w:tc>
-      </w:tr>
-      <w:tr>
-        <w:tc>
-          <w:tcPr>
-            <w:tcW w:w="4968" w:type="dxa"/>
-          </w:tcPr>
-          <w:p>
-            <w:r>
-              <w:lastRenderedPageBreak/>
               <w:t>Flow-Level Data</w:t>
             </w:r>
           </w:p>
@@ -5974,7 +5553,6 @@
     </w:tbl>
     <w:p/>
     <w:sectPr>
-      <w:footerReference w:type="default" r:id="rId8"/>
       <w:pgSz w:w="12240" w:h="15840"/>
       <w:pgMar w:top="1008" w:right="1152" w:bottom="1008" w:left="1152" w:header="720" w:footer="720" w:gutter="0"/>
       <w:cols w:space="720"/>
@@ -6007,23 +5585,6 @@
     </w:p>
   </w:endnote>
 </w:endnotes>
-</file>
-
-<file path=word/footer1.xml><?xml version="1.0" encoding="utf-8"?>
-<w:ftr xmlns:wpc="http://schemas.microsoft.com/office/word/2010/wordprocessingCanvas" xmlns:cx="http://schemas.microsoft.com/office/drawing/2014/chartex" xmlns:cx1="http://schemas.microsoft.com/office/drawing/2015/9/8/chartex" xmlns:cx2="http://schemas.microsoft.com/office/drawing/2015/10/21/chartex" xmlns:cx3="http://schemas.microsoft.com/office/drawing/2016/5/9/chartex" xmlns:cx4="http://schemas.microsoft.com/office/drawing/2016/5/10/chartex" xmlns:cx5="http://schemas.microsoft.com/office/drawing/2016/5/11/chartex" xmlns:cx6="http://schemas.microsoft.com/office/drawing/2016/5/12/chartex" xmlns:cx7="http://schemas.microsoft.com/office/drawing/2016/5/13/chartex" xmlns:cx8="http://schemas.microsoft.com/office/drawing/2016/5/14/chartex" xmlns:mc="http://schemas.openxmlformats.org/markup-compatibility/2006" xmlns:aink="http://schemas.microsoft.com/office/drawing/2016/ink" xmlns:am3d="http://schemas.microsoft.com/office/drawing/2017/model3d" xmlns:o="urn:schemas-microsoft-com:office:office" xmlns:oel="http://schemas.microsoft.com/office/2019/extlst" xmlns:r="http://schemas.openxmlformats.org/officeDocument/2006/relationships" xmlns:m="http://schemas.openxmlformats.org/officeDocument/2006/math" xmlns:v="urn:schemas-microsoft-com:vml" xmlns:wp14="http://schemas.microsoft.com/office/word/2010/wordprocessingDrawing" xmlns:wp="http://schemas.openxmlformats.org/drawingml/2006/wordprocessingDrawing" xmlns:w10="urn:schemas-microsoft-com:office:word" xmlns:w="http://schemas.openxmlformats.org/wordprocessingml/2006/main" xmlns:w14="http://schemas.microsoft.com/office/word/2010/wordml" xmlns:w15="http://schemas.microsoft.com/office/word/2012/wordml" xmlns:w16cex="http://schemas.microsoft.com/office/word/2018/wordml/cex" xmlns:w16cid="http://schemas.microsoft.com/office/word/2016/wordml/cid" xmlns:w16="http://schemas.microsoft.com/office/word/2018/wordml" xmlns:w16du="http://schemas.microsoft.com/office/word/2023/wordml/word16du" xmlns:w16sdtdh="http://schemas.microsoft.com/office/word/2020/wordml/sdtdatahash" xmlns:w16sdtfl="http://schemas.microsoft.com/office/word/2024/wordml/sdtformatlock" xmlns:w16se="http://schemas.microsoft.com/office/word/2015/wordml/symex" xmlns:wpg="http://schemas.microsoft.com/office/word/2010/wordprocessingGroup" xmlns:wpi="http://schemas.microsoft.com/office/word/2010/wordprocessingInk" xmlns:wne="http://schemas.microsoft.com/office/word/2006/wordml" xmlns:wps="http://schemas.microsoft.com/office/word/2010/wordprocessingShape" mc:Ignorable="w14 w15 w16se w16cid w16 w16cex w16sdtdh w16sdtfl w16du wp14">
-  <w:p>
-    <w:pPr>
-      <w:pStyle w:val="Footer"/>
-      <w:jc w:val="center"/>
-    </w:pPr>
-    <w:r>
-      <w:rPr>
-        <w:sz w:val="18"/>
-      </w:rPr>
-      <w:t>SIH26153 — AI-Based Network Attack Forecasting</w:t>
-    </w:r>
-  </w:p>
-</w:ftr>
 </file>
 
 <file path=word/footnotes.xml><?xml version="1.0" encoding="utf-8"?>
@@ -6221,6 +5782,571 @@
       </w:pPr>
       <w:rPr>
         <w:rFonts w:ascii="Symbol" w:hAnsi="Symbol" w:hint="default"/>
+      </w:rPr>
+    </w:lvl>
+  </w:abstractNum>
+  <w:abstractNum w:abstractNumId="9" w15:restartNumberingAfterBreak="0">
+    <w:nsid w:val="296A10CE"/>
+    <w:multiLevelType w:val="multilevel"/>
+    <w:tmpl w:val="C532A0BE"/>
+    <w:lvl w:ilvl="0">
+      <w:start w:val="14"/>
+      <w:numFmt w:val="decimal"/>
+      <w:lvlText w:val="%1"/>
+      <w:lvlJc w:val="left"/>
+      <w:pPr>
+        <w:ind w:left="504" w:hanging="504"/>
+      </w:pPr>
+      <w:rPr>
+        <w:rFonts w:hint="default"/>
+      </w:rPr>
+    </w:lvl>
+    <w:lvl w:ilvl="1">
+      <w:start w:val="2"/>
+      <w:numFmt w:val="decimal"/>
+      <w:lvlText w:val="%1.%2"/>
+      <w:lvlJc w:val="left"/>
+      <w:pPr>
+        <w:ind w:left="504" w:hanging="504"/>
+      </w:pPr>
+      <w:rPr>
+        <w:rFonts w:hint="default"/>
+      </w:rPr>
+    </w:lvl>
+    <w:lvl w:ilvl="2">
+      <w:start w:val="1"/>
+      <w:numFmt w:val="decimal"/>
+      <w:lvlText w:val="%1.%2.%3"/>
+      <w:lvlJc w:val="left"/>
+      <w:pPr>
+        <w:ind w:left="720" w:hanging="720"/>
+      </w:pPr>
+      <w:rPr>
+        <w:rFonts w:hint="default"/>
+      </w:rPr>
+    </w:lvl>
+    <w:lvl w:ilvl="3">
+      <w:start w:val="1"/>
+      <w:numFmt w:val="decimal"/>
+      <w:lvlText w:val="%1.%2.%3.%4"/>
+      <w:lvlJc w:val="left"/>
+      <w:pPr>
+        <w:ind w:left="720" w:hanging="720"/>
+      </w:pPr>
+      <w:rPr>
+        <w:rFonts w:hint="default"/>
+      </w:rPr>
+    </w:lvl>
+    <w:lvl w:ilvl="4">
+      <w:start w:val="1"/>
+      <w:numFmt w:val="decimal"/>
+      <w:lvlText w:val="%1.%2.%3.%4.%5"/>
+      <w:lvlJc w:val="left"/>
+      <w:pPr>
+        <w:ind w:left="1080" w:hanging="1080"/>
+      </w:pPr>
+      <w:rPr>
+        <w:rFonts w:hint="default"/>
+      </w:rPr>
+    </w:lvl>
+    <w:lvl w:ilvl="5">
+      <w:start w:val="1"/>
+      <w:numFmt w:val="decimal"/>
+      <w:lvlText w:val="%1.%2.%3.%4.%5.%6"/>
+      <w:lvlJc w:val="left"/>
+      <w:pPr>
+        <w:ind w:left="1080" w:hanging="1080"/>
+      </w:pPr>
+      <w:rPr>
+        <w:rFonts w:hint="default"/>
+      </w:rPr>
+    </w:lvl>
+    <w:lvl w:ilvl="6">
+      <w:start w:val="1"/>
+      <w:numFmt w:val="decimal"/>
+      <w:lvlText w:val="%1.%2.%3.%4.%5.%6.%7"/>
+      <w:lvlJc w:val="left"/>
+      <w:pPr>
+        <w:ind w:left="1440" w:hanging="1440"/>
+      </w:pPr>
+      <w:rPr>
+        <w:rFonts w:hint="default"/>
+      </w:rPr>
+    </w:lvl>
+    <w:lvl w:ilvl="7">
+      <w:start w:val="1"/>
+      <w:numFmt w:val="decimal"/>
+      <w:lvlText w:val="%1.%2.%3.%4.%5.%6.%7.%8"/>
+      <w:lvlJc w:val="left"/>
+      <w:pPr>
+        <w:ind w:left="1440" w:hanging="1440"/>
+      </w:pPr>
+      <w:rPr>
+        <w:rFonts w:hint="default"/>
+      </w:rPr>
+    </w:lvl>
+    <w:lvl w:ilvl="8">
+      <w:start w:val="1"/>
+      <w:numFmt w:val="decimal"/>
+      <w:lvlText w:val="%1.%2.%3.%4.%5.%6.%7.%8.%9"/>
+      <w:lvlJc w:val="left"/>
+      <w:pPr>
+        <w:ind w:left="1800" w:hanging="1800"/>
+      </w:pPr>
+      <w:rPr>
+        <w:rFonts w:hint="default"/>
+      </w:rPr>
+    </w:lvl>
+  </w:abstractNum>
+  <w:abstractNum w:abstractNumId="10" w15:restartNumberingAfterBreak="0">
+    <w:nsid w:val="486F1E6D"/>
+    <w:multiLevelType w:val="multilevel"/>
+    <w:tmpl w:val="06C644D8"/>
+    <w:lvl w:ilvl="0">
+      <w:start w:val="13"/>
+      <w:numFmt w:val="decimal"/>
+      <w:lvlText w:val="%1"/>
+      <w:lvlJc w:val="left"/>
+      <w:pPr>
+        <w:ind w:left="504" w:hanging="504"/>
+      </w:pPr>
+      <w:rPr>
+        <w:rFonts w:hint="default"/>
+      </w:rPr>
+    </w:lvl>
+    <w:lvl w:ilvl="1">
+      <w:start w:val="3"/>
+      <w:numFmt w:val="decimal"/>
+      <w:lvlText w:val="%1.%2"/>
+      <w:lvlJc w:val="left"/>
+      <w:pPr>
+        <w:ind w:left="504" w:hanging="504"/>
+      </w:pPr>
+      <w:rPr>
+        <w:rFonts w:hint="default"/>
+      </w:rPr>
+    </w:lvl>
+    <w:lvl w:ilvl="2">
+      <w:start w:val="1"/>
+      <w:numFmt w:val="decimal"/>
+      <w:lvlText w:val="%1.%2.%3"/>
+      <w:lvlJc w:val="left"/>
+      <w:pPr>
+        <w:ind w:left="720" w:hanging="720"/>
+      </w:pPr>
+      <w:rPr>
+        <w:rFonts w:hint="default"/>
+      </w:rPr>
+    </w:lvl>
+    <w:lvl w:ilvl="3">
+      <w:start w:val="1"/>
+      <w:numFmt w:val="decimal"/>
+      <w:lvlText w:val="%1.%2.%3.%4"/>
+      <w:lvlJc w:val="left"/>
+      <w:pPr>
+        <w:ind w:left="720" w:hanging="720"/>
+      </w:pPr>
+      <w:rPr>
+        <w:rFonts w:hint="default"/>
+      </w:rPr>
+    </w:lvl>
+    <w:lvl w:ilvl="4">
+      <w:start w:val="1"/>
+      <w:numFmt w:val="decimal"/>
+      <w:lvlText w:val="%1.%2.%3.%4.%5"/>
+      <w:lvlJc w:val="left"/>
+      <w:pPr>
+        <w:ind w:left="1080" w:hanging="1080"/>
+      </w:pPr>
+      <w:rPr>
+        <w:rFonts w:hint="default"/>
+      </w:rPr>
+    </w:lvl>
+    <w:lvl w:ilvl="5">
+      <w:start w:val="1"/>
+      <w:numFmt w:val="decimal"/>
+      <w:lvlText w:val="%1.%2.%3.%4.%5.%6"/>
+      <w:lvlJc w:val="left"/>
+      <w:pPr>
+        <w:ind w:left="1080" w:hanging="1080"/>
+      </w:pPr>
+      <w:rPr>
+        <w:rFonts w:hint="default"/>
+      </w:rPr>
+    </w:lvl>
+    <w:lvl w:ilvl="6">
+      <w:start w:val="1"/>
+      <w:numFmt w:val="decimal"/>
+      <w:lvlText w:val="%1.%2.%3.%4.%5.%6.%7"/>
+      <w:lvlJc w:val="left"/>
+      <w:pPr>
+        <w:ind w:left="1440" w:hanging="1440"/>
+      </w:pPr>
+      <w:rPr>
+        <w:rFonts w:hint="default"/>
+      </w:rPr>
+    </w:lvl>
+    <w:lvl w:ilvl="7">
+      <w:start w:val="1"/>
+      <w:numFmt w:val="decimal"/>
+      <w:lvlText w:val="%1.%2.%3.%4.%5.%6.%7.%8"/>
+      <w:lvlJc w:val="left"/>
+      <w:pPr>
+        <w:ind w:left="1440" w:hanging="1440"/>
+      </w:pPr>
+      <w:rPr>
+        <w:rFonts w:hint="default"/>
+      </w:rPr>
+    </w:lvl>
+    <w:lvl w:ilvl="8">
+      <w:start w:val="1"/>
+      <w:numFmt w:val="decimal"/>
+      <w:lvlText w:val="%1.%2.%3.%4.%5.%6.%7.%8.%9"/>
+      <w:lvlJc w:val="left"/>
+      <w:pPr>
+        <w:ind w:left="1800" w:hanging="1800"/>
+      </w:pPr>
+      <w:rPr>
+        <w:rFonts w:hint="default"/>
+      </w:rPr>
+    </w:lvl>
+  </w:abstractNum>
+  <w:abstractNum w:abstractNumId="11" w15:restartNumberingAfterBreak="0">
+    <w:nsid w:val="6A3548D5"/>
+    <w:multiLevelType w:val="hybridMultilevel"/>
+    <w:tmpl w:val="14E01DF6"/>
+    <w:lvl w:ilvl="0" w:tplc="40090001">
+      <w:start w:val="1"/>
+      <w:numFmt w:val="bullet"/>
+      <w:lvlText w:val=""/>
+      <w:lvlJc w:val="left"/>
+      <w:pPr>
+        <w:ind w:left="1080" w:hanging="360"/>
+      </w:pPr>
+      <w:rPr>
+        <w:rFonts w:ascii="Symbol" w:hAnsi="Symbol" w:hint="default"/>
+      </w:rPr>
+    </w:lvl>
+    <w:lvl w:ilvl="1" w:tplc="40090003" w:tentative="1">
+      <w:start w:val="1"/>
+      <w:numFmt w:val="bullet"/>
+      <w:lvlText w:val="o"/>
+      <w:lvlJc w:val="left"/>
+      <w:pPr>
+        <w:ind w:left="1800" w:hanging="360"/>
+      </w:pPr>
+      <w:rPr>
+        <w:rFonts w:ascii="Courier New" w:hAnsi="Courier New" w:cs="Courier New" w:hint="default"/>
+      </w:rPr>
+    </w:lvl>
+    <w:lvl w:ilvl="2" w:tplc="40090005" w:tentative="1">
+      <w:start w:val="1"/>
+      <w:numFmt w:val="bullet"/>
+      <w:lvlText w:val=""/>
+      <w:lvlJc w:val="left"/>
+      <w:pPr>
+        <w:ind w:left="2520" w:hanging="360"/>
+      </w:pPr>
+      <w:rPr>
+        <w:rFonts w:ascii="Wingdings" w:hAnsi="Wingdings" w:hint="default"/>
+      </w:rPr>
+    </w:lvl>
+    <w:lvl w:ilvl="3" w:tplc="40090001" w:tentative="1">
+      <w:start w:val="1"/>
+      <w:numFmt w:val="bullet"/>
+      <w:lvlText w:val=""/>
+      <w:lvlJc w:val="left"/>
+      <w:pPr>
+        <w:ind w:left="3240" w:hanging="360"/>
+      </w:pPr>
+      <w:rPr>
+        <w:rFonts w:ascii="Symbol" w:hAnsi="Symbol" w:hint="default"/>
+      </w:rPr>
+    </w:lvl>
+    <w:lvl w:ilvl="4" w:tplc="40090003" w:tentative="1">
+      <w:start w:val="1"/>
+      <w:numFmt w:val="bullet"/>
+      <w:lvlText w:val="o"/>
+      <w:lvlJc w:val="left"/>
+      <w:pPr>
+        <w:ind w:left="3960" w:hanging="360"/>
+      </w:pPr>
+      <w:rPr>
+        <w:rFonts w:ascii="Courier New" w:hAnsi="Courier New" w:cs="Courier New" w:hint="default"/>
+      </w:rPr>
+    </w:lvl>
+    <w:lvl w:ilvl="5" w:tplc="40090005" w:tentative="1">
+      <w:start w:val="1"/>
+      <w:numFmt w:val="bullet"/>
+      <w:lvlText w:val=""/>
+      <w:lvlJc w:val="left"/>
+      <w:pPr>
+        <w:ind w:left="4680" w:hanging="360"/>
+      </w:pPr>
+      <w:rPr>
+        <w:rFonts w:ascii="Wingdings" w:hAnsi="Wingdings" w:hint="default"/>
+      </w:rPr>
+    </w:lvl>
+    <w:lvl w:ilvl="6" w:tplc="40090001" w:tentative="1">
+      <w:start w:val="1"/>
+      <w:numFmt w:val="bullet"/>
+      <w:lvlText w:val=""/>
+      <w:lvlJc w:val="left"/>
+      <w:pPr>
+        <w:ind w:left="5400" w:hanging="360"/>
+      </w:pPr>
+      <w:rPr>
+        <w:rFonts w:ascii="Symbol" w:hAnsi="Symbol" w:hint="default"/>
+      </w:rPr>
+    </w:lvl>
+    <w:lvl w:ilvl="7" w:tplc="40090003" w:tentative="1">
+      <w:start w:val="1"/>
+      <w:numFmt w:val="bullet"/>
+      <w:lvlText w:val="o"/>
+      <w:lvlJc w:val="left"/>
+      <w:pPr>
+        <w:ind w:left="6120" w:hanging="360"/>
+      </w:pPr>
+      <w:rPr>
+        <w:rFonts w:ascii="Courier New" w:hAnsi="Courier New" w:cs="Courier New" w:hint="default"/>
+      </w:rPr>
+    </w:lvl>
+    <w:lvl w:ilvl="8" w:tplc="40090005" w:tentative="1">
+      <w:start w:val="1"/>
+      <w:numFmt w:val="bullet"/>
+      <w:lvlText w:val=""/>
+      <w:lvlJc w:val="left"/>
+      <w:pPr>
+        <w:ind w:left="6840" w:hanging="360"/>
+      </w:pPr>
+      <w:rPr>
+        <w:rFonts w:ascii="Wingdings" w:hAnsi="Wingdings" w:hint="default"/>
+      </w:rPr>
+    </w:lvl>
+  </w:abstractNum>
+  <w:abstractNum w:abstractNumId="12" w15:restartNumberingAfterBreak="0">
+    <w:nsid w:val="6D6875D0"/>
+    <w:multiLevelType w:val="multilevel"/>
+    <w:tmpl w:val="16CE2C68"/>
+    <w:lvl w:ilvl="0">
+      <w:start w:val="23"/>
+      <w:numFmt w:val="decimal"/>
+      <w:lvlText w:val="%1"/>
+      <w:lvlJc w:val="left"/>
+      <w:pPr>
+        <w:ind w:left="504" w:hanging="504"/>
+      </w:pPr>
+      <w:rPr>
+        <w:rFonts w:hint="default"/>
+      </w:rPr>
+    </w:lvl>
+    <w:lvl w:ilvl="1">
+      <w:start w:val="1"/>
+      <w:numFmt w:val="decimal"/>
+      <w:lvlText w:val="%1.%2"/>
+      <w:lvlJc w:val="left"/>
+      <w:pPr>
+        <w:ind w:left="504" w:hanging="504"/>
+      </w:pPr>
+      <w:rPr>
+        <w:rFonts w:hint="default"/>
+      </w:rPr>
+    </w:lvl>
+    <w:lvl w:ilvl="2">
+      <w:start w:val="1"/>
+      <w:numFmt w:val="decimal"/>
+      <w:lvlText w:val="%1.%2.%3"/>
+      <w:lvlJc w:val="left"/>
+      <w:pPr>
+        <w:ind w:left="720" w:hanging="720"/>
+      </w:pPr>
+      <w:rPr>
+        <w:rFonts w:hint="default"/>
+      </w:rPr>
+    </w:lvl>
+    <w:lvl w:ilvl="3">
+      <w:start w:val="1"/>
+      <w:numFmt w:val="decimal"/>
+      <w:lvlText w:val="%1.%2.%3.%4"/>
+      <w:lvlJc w:val="left"/>
+      <w:pPr>
+        <w:ind w:left="720" w:hanging="720"/>
+      </w:pPr>
+      <w:rPr>
+        <w:rFonts w:hint="default"/>
+      </w:rPr>
+    </w:lvl>
+    <w:lvl w:ilvl="4">
+      <w:start w:val="1"/>
+      <w:numFmt w:val="decimal"/>
+      <w:lvlText w:val="%1.%2.%3.%4.%5"/>
+      <w:lvlJc w:val="left"/>
+      <w:pPr>
+        <w:ind w:left="1080" w:hanging="1080"/>
+      </w:pPr>
+      <w:rPr>
+        <w:rFonts w:hint="default"/>
+      </w:rPr>
+    </w:lvl>
+    <w:lvl w:ilvl="5">
+      <w:start w:val="1"/>
+      <w:numFmt w:val="decimal"/>
+      <w:lvlText w:val="%1.%2.%3.%4.%5.%6"/>
+      <w:lvlJc w:val="left"/>
+      <w:pPr>
+        <w:ind w:left="1080" w:hanging="1080"/>
+      </w:pPr>
+      <w:rPr>
+        <w:rFonts w:hint="default"/>
+      </w:rPr>
+    </w:lvl>
+    <w:lvl w:ilvl="6">
+      <w:start w:val="1"/>
+      <w:numFmt w:val="decimal"/>
+      <w:lvlText w:val="%1.%2.%3.%4.%5.%6.%7"/>
+      <w:lvlJc w:val="left"/>
+      <w:pPr>
+        <w:ind w:left="1440" w:hanging="1440"/>
+      </w:pPr>
+      <w:rPr>
+        <w:rFonts w:hint="default"/>
+      </w:rPr>
+    </w:lvl>
+    <w:lvl w:ilvl="7">
+      <w:start w:val="1"/>
+      <w:numFmt w:val="decimal"/>
+      <w:lvlText w:val="%1.%2.%3.%4.%5.%6.%7.%8"/>
+      <w:lvlJc w:val="left"/>
+      <w:pPr>
+        <w:ind w:left="1440" w:hanging="1440"/>
+      </w:pPr>
+      <w:rPr>
+        <w:rFonts w:hint="default"/>
+      </w:rPr>
+    </w:lvl>
+    <w:lvl w:ilvl="8">
+      <w:start w:val="1"/>
+      <w:numFmt w:val="decimal"/>
+      <w:lvlText w:val="%1.%2.%3.%4.%5.%6.%7.%8.%9"/>
+      <w:lvlJc w:val="left"/>
+      <w:pPr>
+        <w:ind w:left="1800" w:hanging="1800"/>
+      </w:pPr>
+      <w:rPr>
+        <w:rFonts w:hint="default"/>
+      </w:rPr>
+    </w:lvl>
+  </w:abstractNum>
+  <w:abstractNum w:abstractNumId="13" w15:restartNumberingAfterBreak="0">
+    <w:nsid w:val="7E025DE7"/>
+    <w:multiLevelType w:val="multilevel"/>
+    <w:tmpl w:val="856C24A6"/>
+    <w:lvl w:ilvl="0">
+      <w:start w:val="17"/>
+      <w:numFmt w:val="decimal"/>
+      <w:lvlText w:val="%1"/>
+      <w:lvlJc w:val="left"/>
+      <w:pPr>
+        <w:ind w:left="504" w:hanging="504"/>
+      </w:pPr>
+      <w:rPr>
+        <w:rFonts w:hint="default"/>
+      </w:rPr>
+    </w:lvl>
+    <w:lvl w:ilvl="1">
+      <w:start w:val="3"/>
+      <w:numFmt w:val="decimal"/>
+      <w:lvlText w:val="%1.%2"/>
+      <w:lvlJc w:val="left"/>
+      <w:pPr>
+        <w:ind w:left="504" w:hanging="504"/>
+      </w:pPr>
+      <w:rPr>
+        <w:rFonts w:hint="default"/>
+      </w:rPr>
+    </w:lvl>
+    <w:lvl w:ilvl="2">
+      <w:start w:val="1"/>
+      <w:numFmt w:val="decimal"/>
+      <w:lvlText w:val="%1.%2.%3"/>
+      <w:lvlJc w:val="left"/>
+      <w:pPr>
+        <w:ind w:left="720" w:hanging="720"/>
+      </w:pPr>
+      <w:rPr>
+        <w:rFonts w:hint="default"/>
+      </w:rPr>
+    </w:lvl>
+    <w:lvl w:ilvl="3">
+      <w:start w:val="1"/>
+      <w:numFmt w:val="decimal"/>
+      <w:lvlText w:val="%1.%2.%3.%4"/>
+      <w:lvlJc w:val="left"/>
+      <w:pPr>
+        <w:ind w:left="720" w:hanging="720"/>
+      </w:pPr>
+      <w:rPr>
+        <w:rFonts w:hint="default"/>
+      </w:rPr>
+    </w:lvl>
+    <w:lvl w:ilvl="4">
+      <w:start w:val="1"/>
+      <w:numFmt w:val="decimal"/>
+      <w:lvlText w:val="%1.%2.%3.%4.%5"/>
+      <w:lvlJc w:val="left"/>
+      <w:pPr>
+        <w:ind w:left="1080" w:hanging="1080"/>
+      </w:pPr>
+      <w:rPr>
+        <w:rFonts w:hint="default"/>
+      </w:rPr>
+    </w:lvl>
+    <w:lvl w:ilvl="5">
+      <w:start w:val="1"/>
+      <w:numFmt w:val="decimal"/>
+      <w:lvlText w:val="%1.%2.%3.%4.%5.%6"/>
+      <w:lvlJc w:val="left"/>
+      <w:pPr>
+        <w:ind w:left="1080" w:hanging="1080"/>
+      </w:pPr>
+      <w:rPr>
+        <w:rFonts w:hint="default"/>
+      </w:rPr>
+    </w:lvl>
+    <w:lvl w:ilvl="6">
+      <w:start w:val="1"/>
+      <w:numFmt w:val="decimal"/>
+      <w:lvlText w:val="%1.%2.%3.%4.%5.%6.%7"/>
+      <w:lvlJc w:val="left"/>
+      <w:pPr>
+        <w:ind w:left="1440" w:hanging="1440"/>
+      </w:pPr>
+      <w:rPr>
+        <w:rFonts w:hint="default"/>
+      </w:rPr>
+    </w:lvl>
+    <w:lvl w:ilvl="7">
+      <w:start w:val="1"/>
+      <w:numFmt w:val="decimal"/>
+      <w:lvlText w:val="%1.%2.%3.%4.%5.%6.%7.%8"/>
+      <w:lvlJc w:val="left"/>
+      <w:pPr>
+        <w:ind w:left="1440" w:hanging="1440"/>
+      </w:pPr>
+      <w:rPr>
+        <w:rFonts w:hint="default"/>
+      </w:rPr>
+    </w:lvl>
+    <w:lvl w:ilvl="8">
+      <w:start w:val="1"/>
+      <w:numFmt w:val="decimal"/>
+      <w:lvlText w:val="%1.%2.%3.%4.%5.%6.%7.%8.%9"/>
+      <w:lvlJc w:val="left"/>
+      <w:pPr>
+        <w:ind w:left="1800" w:hanging="1800"/>
+      </w:pPr>
+      <w:rPr>
+        <w:rFonts w:hint="default"/>
       </w:rPr>
     </w:lvl>
   </w:abstractNum>
@@ -6250,6 +6376,21 @@
   </w:num>
   <w:num w:numId="9" w16cid:durableId="34043060">
     <w:abstractNumId w:val="0"/>
+  </w:num>
+  <w:num w:numId="10" w16cid:durableId="983125">
+    <w:abstractNumId w:val="11"/>
+  </w:num>
+  <w:num w:numId="11" w16cid:durableId="914706478">
+    <w:abstractNumId w:val="10"/>
+  </w:num>
+  <w:num w:numId="12" w16cid:durableId="416093159">
+    <w:abstractNumId w:val="9"/>
+  </w:num>
+  <w:num w:numId="13" w16cid:durableId="989556733">
+    <w:abstractNumId w:val="13"/>
+  </w:num>
+  <w:num w:numId="14" w16cid:durableId="1913193488">
+    <w:abstractNumId w:val="12"/>
   </w:num>
 </w:numbering>
 </file>

</xml_diff>